<commit_message>
Revision U02: Ethernet y cableado corregido, CEs alineados e informe de la sesion
</commit_message>
<xml_diff>
--- a/docx/02-ethernet-cableado/02-ethernet-cableado.docx
+++ b/docx/02-ethernet-cableado/02-ethernet-cableado.docx
@@ -117,20 +117,7 @@
         <w:pStyle w:val="BodyText"/>
       </w:pPr>
       <w:r>
-        <w:t xml:space="preserve">Esta unidad se lee como un</w:t>
-      </w:r>
-      <w:r>
-        <w:t xml:space="preserve"> </w:t>
-      </w:r>
-      <w:r>
-        <w:rPr>
-          <w:b/>
-          <w:bCs/>
-        </w:rPr>
-        <w:t xml:space="preserve">libro de 10 capítulos</w:t>
-      </w:r>
-      <w:r>
-        <w:t xml:space="preserve">: los 9 primeros son teoría en progresión y el 10º es el aterrizaje práctico con laboratorio.</w:t>
+        <w:t xml:space="preserve">Esta unidad son 10 puntos: 9 de teoría en progresión y el 10º, aterrizaje práctico.</w:t>
       </w:r>
     </w:p>
     <w:p>
@@ -262,7 +249,7 @@
         </w:numPr>
       </w:pPr>
       <w:r>
-        <w:t xml:space="preserve">Analizar la trama Ethernet: MACs, EtherType, MTU y FCS; comparar 802.3 (guiado) y 802.11 (no guiado).</w:t>
+        <w:t xml:space="preserve">Analizar la trama Ethernet: MACs, EtherType, payload y FCS; comparar 802.3 (guiado) y 802.11 (no guiado).</w:t>
       </w:r>
     </w:p>
     <w:p>
@@ -779,7 +766,7 @@
         <w:pStyle w:val="BlockText"/>
       </w:pPr>
       <w:r>
-        <w:t xml:space="preserve">Practica con los pares del curso: empezar siempre el resuelto para ver el estilo y luego intentar el por-resolver.</w:t>
+        <w:t xml:space="preserve">Practica con los pares del curso: mira 1-2 resueltos para coger el formato, luego intenta el por-resolver; consulta el resuelto solo cuando te atasques.</w:t>
       </w:r>
     </w:p>
     <w:p>
@@ -1062,6 +1049,41 @@
           </w:p>
         </w:tc>
       </w:tr>
+      <w:tr>
+        <w:tc>
+          <w:tcPr/>
+          <w:p>
+            <w:pPr>
+              <w:pStyle w:val="Compact"/>
+            </w:pPr>
+            <w:r>
+              <w:t xml:space="preserve">RA2·f)</w:t>
+            </w:r>
+          </w:p>
+        </w:tc>
+        <w:tc>
+          <w:tcPr/>
+          <w:p>
+            <w:pPr>
+              <w:pStyle w:val="Compact"/>
+            </w:pPr>
+            <w:r>
+              <w:t xml:space="preserve">Integración de dispositivos</w:t>
+            </w:r>
+          </w:p>
+        </w:tc>
+        <w:tc>
+          <w:tcPr/>
+          <w:p>
+            <w:pPr>
+              <w:pStyle w:val="Compact"/>
+            </w:pPr>
+            <w:r>
+              <w:t xml:space="preserve">✅ Cableado estructurado (punto 7) + ⚡ Laboratorio (punto 10)</w:t>
+            </w:r>
+          </w:p>
+        </w:tc>
+      </w:tr>
     </w:tbl>
     <w:p>
       <w:r>
@@ -1206,7 +1228,7 @@
     </w:p>
     <w:bookmarkEnd w:id="24"/>
     <w:bookmarkEnd w:id="25"/>
-    <w:bookmarkStart w:id="42" w:name="medios-de-transmisión"/>
+    <w:bookmarkStart w:id="41" w:name="medios-de-transmisión"/>
     <w:p>
       <w:pPr>
         <w:pStyle w:val="Heading1"/>
@@ -1270,7 +1292,7 @@
         </w:pict>
       </w:r>
     </w:p>
-    <w:bookmarkStart w:id="27" w:name="la-idea-en-una-frase"/>
+    <w:bookmarkStart w:id="26" w:name="la-idea-en-una-frase"/>
     <w:p>
       <w:pPr>
         <w:pStyle w:val="Heading2"/>
@@ -1305,24 +1327,21 @@
         <w:pStyle w:val="FirstParagraph"/>
       </w:pPr>
       <w:r>
-        <w:t xml:space="preserve">En la</w:t>
-      </w:r>
-      <w:r>
-        <w:t xml:space="preserve"> </w:t>
-      </w:r>
-      <w:hyperlink r:id="rId26">
+        <w:t xml:space="preserve">La capa 1 del modelo OSI (la verás a fondo en el</w:t>
+      </w:r>
+      <w:r>
+        <w:t xml:space="preserve"> </w:t>
+      </w:r>
+      <w:hyperlink r:id="rId17">
         <w:r>
           <w:rPr>
             <w:rStyle w:val="Hyperlink"/>
           </w:rPr>
-          <w:t xml:space="preserve">unidad de introducción</w:t>
+          <w:t xml:space="preserve">punto del modelo OSI</w:t>
         </w:r>
       </w:hyperlink>
       <w:r>
-        <w:t xml:space="preserve"> </w:t>
-      </w:r>
-      <w:r>
-        <w:t xml:space="preserve">viste que la capa 1 del modelo OSI se encarga de transmitir</w:t>
+        <w:t xml:space="preserve">) se encarga de transmitir</w:t>
       </w:r>
       <w:r>
         <w:t xml:space="preserve"> </w:t>
@@ -1357,8 +1376,8 @@
         </w:pict>
       </w:r>
     </w:p>
-    <w:bookmarkEnd w:id="27"/>
-    <w:bookmarkStart w:id="31" w:name="los-tres-medios-a-vista-de-pájaro"/>
+    <w:bookmarkEnd w:id="26"/>
+    <w:bookmarkStart w:id="30" w:name="los-tres-medios-a-vista-de-pájaro"/>
     <w:p>
       <w:pPr>
         <w:pStyle w:val="Heading2"/>
@@ -1678,12 +1697,12 @@
           <wp:inline>
             <wp:extent cx="5334000" cy="2967789"/>
             <wp:effectExtent b="0" l="0" r="0" t="0"/>
-            <wp:docPr descr="Los tres medios de transmisión (cobre, fibra y aire) con sus características principales" title="" id="29" name="Picture"/>
+            <wp:docPr descr="Los tres medios de transmisión (cobre, fibra y aire) con sus características principales" title="" id="28" name="Picture"/>
             <a:graphic>
               <a:graphicData uri="http://schemas.openxmlformats.org/drawingml/2006/picture">
                 <pic:pic>
                   <pic:nvPicPr>
-                    <pic:cNvPr descr="public/diagrams/u02-tres-medios.svg" id="30" name="Picture"/>
+                    <pic:cNvPr descr="public/diagrams/u02-tres-medios.svg" id="29" name="Picture"/>
                     <pic:cNvPicPr>
                       <a:picLocks noChangeArrowheads="1" noChangeAspect="1"/>
                     </pic:cNvPicPr>
@@ -1695,7 +1714,7 @@
                           <a14:useLocalDpi xmlns:a14="http://schemas.microsoft.com/office/drawing/2010/main" val="0"/>
                         </a:ext>
                         <a:ext uri="{96DAC541-7B7A-43D3-8B79-37D633B846F1}">
-                          <asvg:svgBlip xmlns:asvg="http://schemas.microsoft.com/office/drawing/2016/SVG/main" r:embed="rId28"/>
+                          <asvg:svgBlip xmlns:asvg="http://schemas.microsoft.com/office/drawing/2016/SVG/main" r:embed="rId27"/>
                         </a:ext>
                       </a:extLst>
                     </a:blip>
@@ -1740,8 +1759,8 @@
         </w:pict>
       </w:r>
     </w:p>
-    <w:bookmarkEnd w:id="31"/>
-    <w:bookmarkStart w:id="32" w:name="el-cobre-el-rey-de-las-lan"/>
+    <w:bookmarkEnd w:id="30"/>
+    <w:bookmarkStart w:id="31" w:name="el-cobre-el-rey-de-las-lan"/>
     <w:p>
       <w:pPr>
         <w:pStyle w:val="Heading2"/>
@@ -1825,7 +1844,7 @@
           <w:rPr>
             <w:rStyle w:val="Hyperlink"/>
           </w:rPr>
-          <w:t xml:space="preserve">punto 7</w:t>
+          <w:t xml:space="preserve">punto 6</w:t>
         </w:r>
       </w:hyperlink>
       <w:r>
@@ -1857,8 +1876,8 @@
         </w:pict>
       </w:r>
     </w:p>
-    <w:bookmarkEnd w:id="32"/>
-    <w:bookmarkStart w:id="33" w:name="la-fibra-óptica-luz-con-superpoderes"/>
+    <w:bookmarkEnd w:id="31"/>
+    <w:bookmarkStart w:id="32" w:name="la-fibra-óptica-luz-con-superpoderes"/>
     <w:p>
       <w:pPr>
         <w:pStyle w:val="Heading2"/>
@@ -2018,8 +2037,8 @@
         </w:pict>
       </w:r>
     </w:p>
-    <w:bookmarkEnd w:id="33"/>
-    <w:bookmarkStart w:id="35" w:name="el-aire-cuando-el-cable-no-llega"/>
+    <w:bookmarkEnd w:id="32"/>
+    <w:bookmarkStart w:id="34" w:name="el-aire-cuando-el-cable-no-llega"/>
     <w:p>
       <w:pPr>
         <w:pStyle w:val="Heading2"/>
@@ -2149,17 +2168,17 @@
         <w:t xml:space="preserve">el WiFi complementa al cable, no lo sustituye</w:t>
       </w:r>
       <w:r>
-        <w:t xml:space="preserve">: los puestos fijos y de alta demanda deben ir por cobre. Lo profundizas en el</w:t>
-      </w:r>
-      <w:r>
-        <w:t xml:space="preserve"> </w:t>
-      </w:r>
-      <w:hyperlink r:id="rId34">
+        <w:t xml:space="preserve">: los puestos fijos y de alta demanda deben ir por cobre. Lo profundizas en la</w:t>
+      </w:r>
+      <w:r>
+        <w:t xml:space="preserve"> </w:t>
+      </w:r>
+      <w:hyperlink r:id="rId33">
         <w:r>
           <w:rPr>
             <w:rStyle w:val="Hyperlink"/>
           </w:rPr>
-          <w:t xml:space="preserve">punto 6</w:t>
+          <w:t xml:space="preserve">unidad de redes inalámbricas</w:t>
         </w:r>
       </w:hyperlink>
       <w:r>
@@ -2173,8 +2192,8 @@
         </w:pict>
       </w:r>
     </w:p>
-    <w:bookmarkEnd w:id="35"/>
-    <w:bookmarkStart w:id="36" w:name="cómo-decidir-en-tres-preguntas"/>
+    <w:bookmarkEnd w:id="34"/>
+    <w:bookmarkStart w:id="35" w:name="cómo-decidir-en-tres-preguntas"/>
     <w:p>
       <w:pPr>
         <w:pStyle w:val="Heading2"/>
@@ -2288,8 +2307,8 @@
         </w:pict>
       </w:r>
     </w:p>
-    <w:bookmarkEnd w:id="36"/>
-    <w:bookmarkStart w:id="37" w:name="misma-capa-distintos-actores"/>
+    <w:bookmarkEnd w:id="35"/>
+    <w:bookmarkStart w:id="36" w:name="misma-capa-distintos-actores"/>
     <w:p>
       <w:pPr>
         <w:pStyle w:val="Heading2"/>
@@ -2519,8 +2538,8 @@
         </w:pict>
       </w:r>
     </w:p>
-    <w:bookmarkEnd w:id="37"/>
-    <w:bookmarkStart w:id="38" w:name="mini-chequeo"/>
+    <w:bookmarkEnd w:id="36"/>
+    <w:bookmarkStart w:id="37" w:name="mini-chequeo"/>
     <w:p>
       <w:pPr>
         <w:pStyle w:val="Heading2"/>
@@ -2675,8 +2694,8 @@
         </w:pict>
       </w:r>
     </w:p>
-    <w:bookmarkEnd w:id="38"/>
-    <w:bookmarkStart w:id="39" w:name="resumen-en-3-frases"/>
+    <w:bookmarkEnd w:id="37"/>
+    <w:bookmarkStart w:id="38" w:name="resumen-en-3-frases"/>
     <w:p>
       <w:pPr>
         <w:pStyle w:val="Heading2"/>
@@ -2795,8 +2814,8 @@
         <w:t xml:space="preserve">, y fibra siempre que la distancia o el caudal lo exijan.</w:t>
       </w:r>
     </w:p>
-    <w:bookmarkEnd w:id="39"/>
-    <w:bookmarkStart w:id="41" w:name="vocabulario-rápido"/>
+    <w:bookmarkEnd w:id="38"/>
+    <w:bookmarkStart w:id="40" w:name="vocabulario-rápido"/>
     <w:p>
       <w:pPr>
         <w:pStyle w:val="Heading2"/>
@@ -2980,7 +2999,7 @@
       <w:r>
         <w:t xml:space="preserve"> </w:t>
       </w:r>
-      <w:hyperlink r:id="rId40">
+      <w:hyperlink r:id="rId39">
         <w:r>
           <w:rPr>
             <w:rStyle w:val="Hyperlink"/>
@@ -3007,7 +3026,7 @@
       <w:r>
         <w:t xml:space="preserve"> </w:t>
       </w:r>
-      <w:hyperlink r:id="rId40">
+      <w:hyperlink r:id="rId39">
         <w:r>
           <w:rPr>
             <w:rStyle w:val="Hyperlink"/>
@@ -3043,9 +3062,9 @@
         </w:r>
       </w:hyperlink>
     </w:p>
+    <w:bookmarkEnd w:id="40"/>
     <w:bookmarkEnd w:id="41"/>
-    <w:bookmarkEnd w:id="42"/>
-    <w:bookmarkStart w:id="57" w:name="el-cable-utp"/>
+    <w:bookmarkStart w:id="56" w:name="el-cable-utp"/>
     <w:p>
       <w:pPr>
         <w:pStyle w:val="Heading1"/>
@@ -3109,7 +3128,7 @@
         </w:pict>
       </w:r>
     </w:p>
-    <w:bookmarkStart w:id="49" w:name="la-idea-en-una-frase-1"/>
+    <w:bookmarkStart w:id="48" w:name="la-idea-en-una-frase-1"/>
     <w:p>
       <w:pPr>
         <w:pStyle w:val="Heading2"/>
@@ -3182,18 +3201,18 @@
           <wp:inline>
             <wp:extent cx="5334000" cy="3547110"/>
             <wp:effectExtent b="0" l="0" r="0" t="0"/>
-            <wp:docPr descr="Cable Ethernet UTP azul con conector RJ45 en primer plano" title="" id="44" name="Picture"/>
+            <wp:docPr descr="Cable Ethernet UTP azul con conector RJ45 en primer plano" title="" id="43" name="Picture"/>
             <a:graphic>
               <a:graphicData uri="http://schemas.openxmlformats.org/drawingml/2006/picture">
                 <pic:pic>
                   <pic:nvPicPr>
-                    <pic:cNvPr descr="public/photos/u02-cable-utp.jpg" id="45" name="Picture"/>
+                    <pic:cNvPr descr="public/photos/u02-cable-utp.jpg" id="44" name="Picture"/>
                     <pic:cNvPicPr>
                       <a:picLocks noChangeArrowheads="1" noChangeAspect="1"/>
                     </pic:cNvPicPr>
                   </pic:nvPicPr>
                   <pic:blipFill>
-                    <a:blip r:embed="rId43"/>
+                    <a:blip r:embed="rId42"/>
                     <a:stretch>
                       <a:fillRect/>
                     </a:stretch>
@@ -3237,12 +3256,12 @@
           <wp:inline>
             <wp:extent cx="5334000" cy="3336851"/>
             <wp:effectExtent b="0" l="0" r="0" t="0"/>
-            <wp:docPr descr="Anatomía del cable UTP: funda, 4 pares trenzados y sus colores T568B" title="" id="47" name="Picture"/>
+            <wp:docPr descr="Anatomía del cable UTP: funda, 4 pares trenzados y sus colores T568B" title="" id="46" name="Picture"/>
             <a:graphic>
               <a:graphicData uri="http://schemas.openxmlformats.org/drawingml/2006/picture">
                 <pic:pic>
                   <pic:nvPicPr>
-                    <pic:cNvPr descr="public/diagrams/u02-anatomia-utp.svg" id="48" name="Picture"/>
+                    <pic:cNvPr descr="public/diagrams/u02-anatomia-utp.svg" id="47" name="Picture"/>
                     <pic:cNvPicPr>
                       <a:picLocks noChangeArrowheads="1" noChangeAspect="1"/>
                     </pic:cNvPicPr>
@@ -3254,7 +3273,7 @@
                           <a14:useLocalDpi xmlns:a14="http://schemas.microsoft.com/office/drawing/2010/main" val="0"/>
                         </a:ext>
                         <a:ext uri="{96DAC541-7B7A-43D3-8B79-37D633B846F1}">
-                          <asvg:svgBlip xmlns:asvg="http://schemas.microsoft.com/office/drawing/2016/SVG/main" r:embed="rId46"/>
+                          <asvg:svgBlip xmlns:asvg="http://schemas.microsoft.com/office/drawing/2016/SVG/main" r:embed="rId45"/>
                         </a:ext>
                       </a:extLst>
                     </a:blip>
@@ -3299,8 +3318,8 @@
         </w:pict>
       </w:r>
     </w:p>
-    <w:bookmarkEnd w:id="49"/>
-    <w:bookmarkStart w:id="50" w:name="los-8-hilos-y-sus-colores"/>
+    <w:bookmarkEnd w:id="48"/>
+    <w:bookmarkStart w:id="49" w:name="los-8-hilos-y-sus-colores"/>
     <w:p>
       <w:pPr>
         <w:pStyle w:val="Heading2"/>
@@ -3887,7 +3906,19 @@
         <w:t xml:space="preserve">mismos pines en las dos normas</w:t>
       </w:r>
       <w:r>
-        <w:t xml:space="preserve">; solo cambian los pares 2 y 3 (naranja y verde). El orden está pensado para que cada par cancelativo use pines adyacentes (1-2, 3-6, 4-5, 7-8).</w:t>
+        <w:t xml:space="preserve">; solo cambian los pares 2 y 3 (naranja y verde). El orden asigna a cada par una pareja de pines fija (1-2, 3-6, 4-5 y 7-8); fíjate en que 3-6</w:t>
+      </w:r>
+      <w:r>
+        <w:t xml:space="preserve"> </w:t>
+      </w:r>
+      <w:r>
+        <w:t xml:space="preserve">“salta”</w:t>
+      </w:r>
+      <w:r>
+        <w:t xml:space="preserve"> </w:t>
+      </w:r>
+      <w:r>
+        <w:t xml:space="preserve">sobre 4-5, justo la particularidad que aprovecha un split pair para despistar al tester.</w:t>
       </w:r>
     </w:p>
     <w:p>
@@ -3897,8 +3928,8 @@
         </w:pict>
       </w:r>
     </w:p>
-    <w:bookmarkEnd w:id="50"/>
-    <w:bookmarkStart w:id="51" w:name="por-qué-se-trenzan-los-pares"/>
+    <w:bookmarkEnd w:id="49"/>
+    <w:bookmarkStart w:id="50" w:name="por-qué-se-trenzan-los-pares"/>
     <w:p>
       <w:pPr>
         <w:pStyle w:val="Heading2"/>
@@ -4016,25 +4047,13 @@
           <w:b/>
           <w:bCs/>
         </w:rPr>
-        <w:t xml:space="preserve">Analogía del ascensor:</w:t>
-      </w:r>
-      <w:r>
-        <w:t xml:space="preserve"> </w:t>
-      </w:r>
-      <w:r>
-        <w:t xml:space="preserve">si dos parejas suben a la vez en un ascensor lleno, se pisan los pies. Si una vez sube trenzada y otra destrenzada… en fin, cada pareja con su</w:t>
-      </w:r>
-      <w:r>
-        <w:t xml:space="preserve"> </w:t>
-      </w:r>
-      <w:r>
-        <w:t xml:space="preserve">“paso”</w:t>
-      </w:r>
-      <w:r>
-        <w:t xml:space="preserve"> </w:t>
-      </w:r>
-      <w:r>
-        <w:t xml:space="preserve">es menos probable que pisen al otro. Eso es el paso de trenzado.</w:t>
+        <w:t xml:space="preserve">Analogía del paso de trenzado:</w:t>
+      </w:r>
+      <w:r>
+        <w:t xml:space="preserve"> </w:t>
+      </w:r>
+      <w:r>
+        <w:t xml:space="preserve">si dos coches van en paralelo con el mismo ritmo de balizas, sus señales se acoplan y se suman; si cada uno marca un ritmo distinto, las señales nunca coinciden en el mismo punto y el acoplamiento se dispersa. Eso hace cada par con su número de vueltas por metro.</w:t>
       </w:r>
     </w:p>
     <w:p>
@@ -4044,8 +4063,8 @@
         </w:pict>
       </w:r>
     </w:p>
-    <w:bookmarkEnd w:id="51"/>
-    <w:bookmarkStart w:id="52" w:name="categorías-cat5e-cat6-cat6a-cat7-cat8"/>
+    <w:bookmarkEnd w:id="50"/>
+    <w:bookmarkStart w:id="51" w:name="categorías-cat5e-cat6-cat6a-cat7-cat8"/>
     <w:p>
       <w:pPr>
         <w:pStyle w:val="Heading2"/>
@@ -4511,8 +4530,8 @@
         </w:pict>
       </w:r>
     </w:p>
-    <w:bookmarkEnd w:id="52"/>
-    <w:bookmarkStart w:id="53" w:name="cat5e-cat6-qué-compro"/>
+    <w:bookmarkEnd w:id="51"/>
+    <w:bookmarkStart w:id="52" w:name="cat5e-cat6-qué-compro"/>
     <w:p>
       <w:pPr>
         <w:pStyle w:val="Heading2"/>
@@ -4705,8 +4724,8 @@
         </w:pict>
       </w:r>
     </w:p>
-    <w:bookmarkEnd w:id="53"/>
-    <w:bookmarkStart w:id="54" w:name="mini-chequeo-1"/>
+    <w:bookmarkEnd w:id="52"/>
+    <w:bookmarkStart w:id="53" w:name="mini-chequeo-1"/>
     <w:p>
       <w:pPr>
         <w:pStyle w:val="Heading2"/>
@@ -4845,8 +4864,8 @@
         </w:pict>
       </w:r>
     </w:p>
-    <w:bookmarkEnd w:id="54"/>
-    <w:bookmarkStart w:id="55" w:name="resumen-en-3-frases-1"/>
+    <w:bookmarkEnd w:id="53"/>
+    <w:bookmarkStart w:id="54" w:name="resumen-en-3-frases-1"/>
     <w:p>
       <w:pPr>
         <w:pStyle w:val="Heading2"/>
@@ -4936,8 +4955,8 @@
         <w:t xml:space="preserve">(Cat5e → Cat8) marca la velocidad y distancia máximas; para 10 Gbps a 100 m hace falta Cat6a.</w:t>
       </w:r>
     </w:p>
-    <w:bookmarkEnd w:id="55"/>
-    <w:bookmarkStart w:id="56" w:name="vocabulario-rápido-1"/>
+    <w:bookmarkEnd w:id="54"/>
+    <w:bookmarkStart w:id="55" w:name="vocabulario-rápido-1"/>
     <w:p>
       <w:pPr>
         <w:pStyle w:val="Heading2"/>
@@ -5122,7 +5141,7 @@
       <w:r>
         <w:t xml:space="preserve"> </w:t>
       </w:r>
-      <w:hyperlink r:id="rId40">
+      <w:hyperlink r:id="rId39">
         <w:r>
           <w:rPr>
             <w:rStyle w:val="Hyperlink"/>
@@ -5185,9 +5204,9 @@
         </w:r>
       </w:hyperlink>
     </w:p>
+    <w:bookmarkEnd w:id="55"/>
     <w:bookmarkEnd w:id="56"/>
-    <w:bookmarkEnd w:id="57"/>
-    <w:bookmarkStart w:id="70" w:name="directo-cruzado-y-consola"/>
+    <w:bookmarkStart w:id="69" w:name="directo-cruzado-y-consola"/>
     <w:p>
       <w:pPr>
         <w:pStyle w:val="Heading1"/>
@@ -5251,7 +5270,7 @@
         </w:pict>
       </w:r>
     </w:p>
-    <w:bookmarkStart w:id="58" w:name="la-idea-en-una-frase-2"/>
+    <w:bookmarkStart w:id="57" w:name="la-idea-en-una-frase-2"/>
     <w:p>
       <w:pPr>
         <w:pStyle w:val="Heading2"/>
@@ -5348,8 +5367,8 @@
         </w:pict>
       </w:r>
     </w:p>
-    <w:bookmarkEnd w:id="58"/>
-    <w:bookmarkStart w:id="62" w:name="las-dos-normas-t568a-y-t568b"/>
+    <w:bookmarkEnd w:id="57"/>
+    <w:bookmarkStart w:id="61" w:name="las-dos-normas-t568a-y-t568b"/>
     <w:p>
       <w:pPr>
         <w:pStyle w:val="Heading2"/>
@@ -5760,12 +5779,12 @@
           <wp:inline>
             <wp:extent cx="5334000" cy="3247813"/>
             <wp:effectExtent b="0" l="0" r="0" t="0"/>
-            <wp:docPr descr="Pinout T568B: orden de los 8 hilos en el conector RJ45" title="" id="60" name="Picture"/>
+            <wp:docPr descr="Pinout T568B: orden de los 8 hilos en el conector RJ45" title="" id="59" name="Picture"/>
             <a:graphic>
               <a:graphicData uri="http://schemas.openxmlformats.org/drawingml/2006/picture">
                 <pic:pic>
                   <pic:nvPicPr>
-                    <pic:cNvPr descr="public/diagrams/u02-pinout-t568.svg" id="61" name="Picture"/>
+                    <pic:cNvPr descr="public/diagrams/u02-pinout-t568.svg" id="60" name="Picture"/>
                     <pic:cNvPicPr>
                       <a:picLocks noChangeArrowheads="1" noChangeAspect="1"/>
                     </pic:cNvPicPr>
@@ -5777,7 +5796,7 @@
                           <a14:useLocalDpi xmlns:a14="http://schemas.microsoft.com/office/drawing/2010/main" val="0"/>
                         </a:ext>
                         <a:ext uri="{96DAC541-7B7A-43D3-8B79-37D633B846F1}">
-                          <asvg:svgBlip xmlns:asvg="http://schemas.microsoft.com/office/drawing/2016/SVG/main" r:embed="rId59"/>
+                          <asvg:svgBlip xmlns:asvg="http://schemas.microsoft.com/office/drawing/2016/SVG/main" r:embed="rId58"/>
                         </a:ext>
                       </a:extLst>
                     </a:blip>
@@ -5822,8 +5841,8 @@
         </w:pict>
       </w:r>
     </w:p>
-    <w:bookmarkEnd w:id="62"/>
-    <w:bookmarkStart w:id="63" w:name="cable-directo-straight-through"/>
+    <w:bookmarkEnd w:id="61"/>
+    <w:bookmarkStart w:id="62" w:name="cable-directo-straight-through"/>
     <w:p>
       <w:pPr>
         <w:pStyle w:val="Heading2"/>
@@ -5860,10 +5879,7 @@
         <w:t xml:space="preserve">distinto tipo</w:t>
       </w:r>
       <w:r>
-        <w:t xml:space="preserve"> </w:t>
-      </w:r>
-      <w:r>
-        <w:t xml:space="preserve">— en realidad, dispositivos que usan el mismo par para enviar que para recibir… simplificando: los que NO son</w:t>
+        <w:t xml:space="preserve">, cuyos pines de envío y de recepción ya son complementarios: el que transmite por unos pines, el otro escucha por esos mismos. En la práctica, los que NO son</w:t>
       </w:r>
       <w:r>
         <w:t xml:space="preserve"> </w:t>
@@ -6000,8 +6016,8 @@
         </w:pict>
       </w:r>
     </w:p>
-    <w:bookmarkEnd w:id="63"/>
-    <w:bookmarkStart w:id="64" w:name="cable-cruzado-crossover"/>
+    <w:bookmarkEnd w:id="62"/>
+    <w:bookmarkStart w:id="63" w:name="cable-cruzado-crossover"/>
     <w:p>
       <w:pPr>
         <w:pStyle w:val="Heading2"/>
@@ -6041,7 +6057,8 @@
     <w:tbl>
       <w:tblPr>
         <w:tblStyle w:val="Table"/>
-        <w:tblW w:type="auto" w:w="0"/>
+        <w:tblW w:type="pct" w:w="5000"/>
+        <w:tblLayout w:type="fixed"/>
         <w:tblLook w:firstRow="1" w:lastRow="0" w:firstColumn="0" w:lastColumn="0" w:noHBand="0" w:noVBand="0" w:val="0020"/>
       </w:tblPr>
       <w:tblGrid>
@@ -6147,7 +6164,48 @@
           </w:p>
         </w:tc>
       </w:tr>
+      <w:tr>
+        <w:tc>
+          <w:tcPr/>
+          <w:p>
+            <w:pPr>
+              <w:pStyle w:val="Compact"/>
+            </w:pPr>
+            <w:r>
+              <w:t xml:space="preserve">PC ↔ Router</w:t>
+            </w:r>
+          </w:p>
+        </w:tc>
+        <w:tc>
+          <w:tcPr/>
+          <w:p>
+            <w:pPr>
+              <w:pStyle w:val="Compact"/>
+            </w:pPr>
+            <w:r>
+              <w:t xml:space="preserve">Router con puerto Ethernet sin Auto MDI-X (caso clásico de examen)</w:t>
+            </w:r>
+          </w:p>
+        </w:tc>
+      </w:tr>
     </w:tbl>
+    <w:p>
+      <w:pPr>
+        <w:pStyle w:val="BodyText"/>
+      </w:pPr>
+      <w:r>
+        <w:t xml:space="preserve">Ojo con PC ↔ Router: son</w:t>
+      </w:r>
+      <w:r>
+        <w:t xml:space="preserve"> </w:t>
+      </w:r>
+      <w:r>
+        <w:t xml:space="preserve">“distintos”</w:t>
+      </w:r>
+      <w:r>
+        <w:t xml:space="preserve">, pero los dos transmiten por los mismos pines, así que necesitan cruzado (el mismo razonamiento que con dos switches).</w:t>
+      </w:r>
+    </w:p>
     <w:p>
       <w:pPr>
         <w:pStyle w:val="BlockText"/>
@@ -6195,8 +6253,8 @@
         </w:pict>
       </w:r>
     </w:p>
-    <w:bookmarkEnd w:id="64"/>
-    <w:bookmarkStart w:id="65" w:name="cable-de-consola-rollover"/>
+    <w:bookmarkEnd w:id="63"/>
+    <w:bookmarkStart w:id="64" w:name="cable-de-consola-rollover"/>
     <w:p>
       <w:pPr>
         <w:pStyle w:val="Heading2"/>
@@ -6326,8 +6384,8 @@
         </w:pict>
       </w:r>
     </w:p>
-    <w:bookmarkEnd w:id="65"/>
-    <w:bookmarkStart w:id="66" w:name="resumen-rápido-de-los-tres-cables"/>
+    <w:bookmarkEnd w:id="64"/>
+    <w:bookmarkStart w:id="65" w:name="resumen-rápido-de-los-tres-cables"/>
     <w:p>
       <w:pPr>
         <w:pStyle w:val="Heading2"/>
@@ -6493,7 +6551,7 @@
               <w:pStyle w:val="Compact"/>
             </w:pPr>
             <w:r>
-              <w:t xml:space="preserve">PC ↔ PC, Switch ↔ Switch, Router ↔ Router</w:t>
+              <w:t xml:space="preserve">PC ↔ PC, Switch ↔ Switch, Router ↔ Router, PC ↔ Router</w:t>
             </w:r>
           </w:p>
         </w:tc>
@@ -6617,8 +6675,8 @@
         </w:pict>
       </w:r>
     </w:p>
-    <w:bookmarkEnd w:id="66"/>
-    <w:bookmarkStart w:id="67" w:name="mini-chequeo-2"/>
+    <w:bookmarkEnd w:id="65"/>
+    <w:bookmarkStart w:id="66" w:name="mini-chequeo-2"/>
     <w:p>
       <w:pPr>
         <w:pStyle w:val="Heading2"/>
@@ -6712,10 +6770,10 @@
           <w:b/>
           <w:bCs/>
         </w:rPr>
-        <w:t xml:space="preserve">En un simulador antiguo no funcionará de forma fiable y podría haber problemas de enlace</w:t>
-      </w:r>
-      <w:r>
-        <w:t xml:space="preserve">: dos switches son del mismo tipo y necesitan pares intercambiados. Usarías un</w:t>
+        <w:t xml:space="preserve">No: no llegan a enlazar</w:t>
+      </w:r>
+      <w:r>
+        <w:t xml:space="preserve">, porque los dos switches transmiten por los mismos pines. Necesitas un</w:t>
       </w:r>
       <w:r>
         <w:t xml:space="preserve"> </w:t>
@@ -6731,7 +6789,7 @@
         <w:t xml:space="preserve"> </w:t>
       </w:r>
       <w:r>
-        <w:t xml:space="preserve">(T568A en un extremo, T568B en el otro).</w:t>
+        <w:t xml:space="preserve">(T568A en un extremo, T568B en el otro), que intercambia los pares 2 y 3 para que lo que uno transmite lo reciba el otro.</w:t>
       </w:r>
     </w:p>
     <w:p>
@@ -6785,8 +6843,8 @@
         </w:pict>
       </w:r>
     </w:p>
-    <w:bookmarkEnd w:id="67"/>
-    <w:bookmarkStart w:id="68" w:name="resumen-en-3-frases-2"/>
+    <w:bookmarkEnd w:id="66"/>
+    <w:bookmarkStart w:id="67" w:name="resumen-en-3-frases-2"/>
     <w:p>
       <w:pPr>
         <w:pStyle w:val="Heading2"/>
@@ -6886,8 +6944,8 @@
         <w:t xml:space="preserve">(pines invertidos) es el cable de consola para configurar switches y routers Cisco desde el PC.</w:t>
       </w:r>
     </w:p>
-    <w:bookmarkEnd w:id="68"/>
-    <w:bookmarkStart w:id="69" w:name="vocabulario-rápido-2"/>
+    <w:bookmarkEnd w:id="67"/>
+    <w:bookmarkStart w:id="68" w:name="vocabulario-rápido-2"/>
     <w:p>
       <w:pPr>
         <w:pStyle w:val="Heading2"/>
@@ -7096,7 +7154,7 @@
       <w:r>
         <w:t xml:space="preserve"> </w:t>
       </w:r>
-      <w:hyperlink r:id="rId40">
+      <w:hyperlink r:id="rId39">
         <w:r>
           <w:rPr>
             <w:rStyle w:val="Hyperlink"/>
@@ -7159,9 +7217,9 @@
         </w:r>
       </w:hyperlink>
     </w:p>
+    <w:bookmarkEnd w:id="68"/>
     <w:bookmarkEnd w:id="69"/>
-    <w:bookmarkEnd w:id="70"/>
-    <w:bookmarkStart w:id="86" w:name="crimpado-y-comprobación"/>
+    <w:bookmarkStart w:id="85" w:name="crimpado-y-comprobación"/>
     <w:p>
       <w:pPr>
         <w:pStyle w:val="Heading1"/>
@@ -7225,7 +7283,7 @@
         </w:pict>
       </w:r>
     </w:p>
-    <w:bookmarkStart w:id="71" w:name="la-idea-en-una-frase-3"/>
+    <w:bookmarkStart w:id="70" w:name="la-idea-en-una-frase-3"/>
     <w:p>
       <w:pPr>
         <w:pStyle w:val="Heading2"/>
@@ -7303,8 +7361,8 @@
         </w:pict>
       </w:r>
     </w:p>
-    <w:bookmarkEnd w:id="71"/>
-    <w:bookmarkStart w:id="75" w:name="material-necesario"/>
+    <w:bookmarkEnd w:id="70"/>
+    <w:bookmarkStart w:id="74" w:name="material-necesario"/>
     <w:p>
       <w:pPr>
         <w:pStyle w:val="Heading2"/>
@@ -7398,7 +7456,7 @@
         <w:t xml:space="preserve"> </w:t>
       </w:r>
       <w:r>
-        <w:t xml:space="preserve">(Cat5e/Cat6, según categoría que quieras).</w:t>
+        <w:t xml:space="preserve">(Cat5e/Cat6, según la categoría que uses).</w:t>
       </w:r>
     </w:p>
     <w:p>
@@ -7456,18 +7514,18 @@
           <wp:inline>
             <wp:extent cx="5334000" cy="3556000"/>
             <wp:effectExtent b="0" l="0" r="0" t="0"/>
-            <wp:docPr descr="Conector RJ45 sobre el cable: la pieza que vas a crimpar" title="" id="73" name="Picture"/>
+            <wp:docPr descr="Conector RJ45 sobre el cable: la pieza que vas a crimpar" title="" id="72" name="Picture"/>
             <a:graphic>
               <a:graphicData uri="http://schemas.openxmlformats.org/drawingml/2006/picture">
                 <pic:pic>
                   <pic:nvPicPr>
-                    <pic:cNvPr descr="public/photos/u02-rj45.jpg" id="74" name="Picture"/>
+                    <pic:cNvPr descr="public/photos/u02-rj45.jpg" id="73" name="Picture"/>
                     <pic:cNvPicPr>
                       <a:picLocks noChangeArrowheads="1" noChangeAspect="1"/>
                     </pic:cNvPicPr>
                   </pic:nvPicPr>
                   <pic:blipFill>
-                    <a:blip r:embed="rId72"/>
+                    <a:blip r:embed="rId71"/>
                     <a:stretch>
                       <a:fillRect/>
                     </a:stretch>
@@ -7509,8 +7567,8 @@
         </w:pict>
       </w:r>
     </w:p>
-    <w:bookmarkEnd w:id="75"/>
-    <w:bookmarkStart w:id="79" w:name="el-crimpado-paso-a-paso-norma-t568b"/>
+    <w:bookmarkEnd w:id="74"/>
+    <w:bookmarkStart w:id="78" w:name="el-crimpado-paso-a-paso-norma-t568b"/>
     <w:p>
       <w:pPr>
         <w:pStyle w:val="Heading2"/>
@@ -7589,7 +7647,35 @@
         <w:t xml:space="preserve">T568B</w:t>
       </w:r>
       <w:r>
-        <w:t xml:space="preserve">, de izquierda a derecha con el clip del conector hacia abajo: Blanco/Naranja, Naranja, Blanco/Verde, Azul, Blanco/Azul, Verde, Blanco/Marrón, Marrón. Termina</w:t>
+        <w:t xml:space="preserve">, de izquierda a derecha con el clip del conector hacia abajo: Blanco/Naranja, Naranja, Blanco/Verde, Azul, Blanco/Azul, Verde, Blanco/Marrón, Marrón. Fíjate en que el par verde va</w:t>
+      </w:r>
+      <w:r>
+        <w:t xml:space="preserve"> </w:t>
+      </w:r>
+      <w:r>
+        <w:rPr>
+          <w:b/>
+          <w:bCs/>
+        </w:rPr>
+        <w:t xml:space="preserve">partido</w:t>
+      </w:r>
+      <w:r>
+        <w:t xml:space="preserve"> </w:t>
+      </w:r>
+      <w:r>
+        <w:t xml:space="preserve">(blanco/verde en el pin 3 y verde en el 6, con el par azul 4-5 en medio): es correcto, no lo</w:t>
+      </w:r>
+      <w:r>
+        <w:t xml:space="preserve"> </w:t>
+      </w:r>
+      <w:r>
+        <w:t xml:space="preserve">“arregles”</w:t>
+      </w:r>
+      <w:r>
+        <w:t xml:space="preserve"> </w:t>
+      </w:r>
+      <w:r>
+        <w:t xml:space="preserve">juntando parejas. Termina</w:t>
       </w:r>
       <w:r>
         <w:t xml:space="preserve"> </w:t>
@@ -7605,7 +7691,7 @@
         <w:t xml:space="preserve"> </w:t>
       </w:r>
       <w:r>
-        <w:t xml:space="preserve">los pares 4-5 (azul) tras los 1-2, con el blanco/azul a la derecha del azul, para que el orden quede limpio y plano.</w:t>
+        <w:t xml:space="preserve">los hilos bien parallelos.</w:t>
       </w:r>
     </w:p>
     <w:p>
@@ -7771,12 +7857,12 @@
           <wp:inline>
             <wp:extent cx="5334000" cy="3332960"/>
             <wp:effectExtent b="0" l="0" r="0" t="0"/>
-            <wp:docPr descr="Crimpado paso a paso (T568B): pelar, ordenar, cortar, insertar, crimpar y comprobar" title="" id="77" name="Picture"/>
+            <wp:docPr descr="Crimpado paso a paso (T568B): pelar, ordenar, cortar, insertar, crimpar y comprobar" title="" id="76" name="Picture"/>
             <a:graphic>
               <a:graphicData uri="http://schemas.openxmlformats.org/drawingml/2006/picture">
                 <pic:pic>
                   <pic:nvPicPr>
-                    <pic:cNvPr descr="public/diagrams/u02-crimpado-pasos.svg" id="78" name="Picture"/>
+                    <pic:cNvPr descr="public/diagrams/u02-crimpado-pasos.svg" id="77" name="Picture"/>
                     <pic:cNvPicPr>
                       <a:picLocks noChangeArrowheads="1" noChangeAspect="1"/>
                     </pic:cNvPicPr>
@@ -7788,7 +7874,7 @@
                           <a14:useLocalDpi xmlns:a14="http://schemas.microsoft.com/office/drawing/2010/main" val="0"/>
                         </a:ext>
                         <a:ext uri="{96DAC541-7B7A-43D3-8B79-37D633B846F1}">
-                          <asvg:svgBlip xmlns:asvg="http://schemas.microsoft.com/office/drawing/2016/SVG/main" r:embed="rId76"/>
+                          <asvg:svgBlip xmlns:asvg="http://schemas.microsoft.com/office/drawing/2016/SVG/main" r:embed="rId75"/>
                         </a:ext>
                       </a:extLst>
                     </a:blip>
@@ -7833,8 +7919,8 @@
         </w:pict>
       </w:r>
     </w:p>
-    <w:bookmarkEnd w:id="79"/>
-    <w:bookmarkStart w:id="80" w:name="el-tester-qué-te-dice-con-sus-leds"/>
+    <w:bookmarkEnd w:id="78"/>
+    <w:bookmarkStart w:id="79" w:name="el-tester-qué-te-dice-con-sus-leds"/>
     <w:p>
       <w:pPr>
         <w:pStyle w:val="Heading2"/>
@@ -8135,7 +8221,7 @@
           <w:rPr>
             <w:rStyle w:val="Hyperlink"/>
           </w:rPr>
-          <w:t xml:space="preserve">conceptos del punto 7</w:t>
+          <w:t xml:space="preserve">conceptos del punto 6</w:t>
         </w:r>
       </w:hyperlink>
       <w:r>
@@ -8149,8 +8235,8 @@
         </w:pict>
       </w:r>
     </w:p>
-    <w:bookmarkEnd w:id="80"/>
-    <w:bookmarkStart w:id="81" w:name="X8bbc762308db20c6ee5873f0c6214c5d25e867c"/>
+    <w:bookmarkEnd w:id="79"/>
+    <w:bookmarkStart w:id="80" w:name="X8bbc762308db20c6ee5873f0c6214c5d25e867c"/>
     <w:p>
       <w:pPr>
         <w:pStyle w:val="Heading2"/>
@@ -8190,7 +8276,7 @@
         <w:t xml:space="preserve"> </w:t>
       </w:r>
       <w:r>
-        <w:t xml:space="preserve">(ej. Blanco/Naranja va al pin 3 en lugar de al 1). El tester básico a veces muestra todo en orden —porque hay continuidad— y el cable parece funcionar… a baja velocidad y con errores intermitentes. Ethernet sobre cables así da problemas difíciles de pillar.</w:t>
+        <w:t xml:space="preserve">(ej. ordenaste los hilos por parejas contiguas y el par azul quedó en los pines 3-4 en vez del 4-5). El tester básico a veces muestra todo en orden —porque hay continuidad de pin a pin— y el cable parece funcionar… a baja velocidad y con errores intermitentes. Ethernet sobre cables así da problemas difíciles de pillar.</w:t>
       </w:r>
     </w:p>
     <w:p>
@@ -8226,7 +8312,23 @@
         <w:t xml:space="preserve"> </w:t>
       </w:r>
       <w:r>
-        <w:t xml:space="preserve">En un extremo metes Naranja donde iba Blanco/Naranja y viceversa. Los LEDs 1-2 aparecen intercambiados en uno de los módulos. Funciona como crossover accidental y puede dar problemas según los dispositivos.</w:t>
+        <w:t xml:space="preserve">En un extremo metes Naranja donde iba Blanco/Naranja y viceversa. Los LEDs 1-2 aparecen intercambiados en uno de los módulos. Eso es una</w:t>
+      </w:r>
+      <w:r>
+        <w:t xml:space="preserve"> </w:t>
+      </w:r>
+      <w:r>
+        <w:rPr>
+          <w:b/>
+          <w:bCs/>
+        </w:rPr>
+        <w:t xml:space="preserve">inversión de polaridad</w:t>
+      </w:r>
+      <w:r>
+        <w:t xml:space="preserve"> </w:t>
+      </w:r>
+      <w:r>
+        <w:t xml:space="preserve">en ese par (no un crossover): algunos equipos la corrigen solos y otros no, así que el enlace puede ser inestable.</w:t>
       </w:r>
     </w:p>
     <w:p>
@@ -8277,23 +8379,7 @@
         <w:t xml:space="preserve">“funciona a 100 en vez de a 1000”</w:t>
       </w:r>
       <w:r>
-        <w:t xml:space="preserve">, sospecha de</w:t>
-      </w:r>
-      <w:r>
-        <w:t xml:space="preserve"> </w:t>
-      </w:r>
-      <w:r>
-        <w:rPr>
-          <w:b/>
-          <w:bCs/>
-        </w:rPr>
-        <w:t xml:space="preserve">faltan pares</w:t>
-      </w:r>
-      <w:r>
-        <w:t xml:space="preserve"> </w:t>
-      </w:r>
-      <w:r>
-        <w:t xml:space="preserve">(hilos 7-8 muertos) o de un</w:t>
+        <w:t xml:space="preserve">, sospecha de pares faltantes (hilos 7-8 muertos) o de un</w:t>
       </w:r>
       <w:r>
         <w:t xml:space="preserve"> </w:t>
@@ -8316,8 +8402,8 @@
         </w:pict>
       </w:r>
     </w:p>
-    <w:bookmarkEnd w:id="81"/>
-    <w:bookmarkStart w:id="82" w:name="X4dd96a7f67c8ddd72b04952d578bd021e29cccb"/>
+    <w:bookmarkEnd w:id="80"/>
+    <w:bookmarkStart w:id="81" w:name="X4dd96a7f67c8ddd72b04952d578bd021e29cccb"/>
     <w:p>
       <w:pPr>
         <w:pStyle w:val="Heading2"/>
@@ -8500,8 +8586,8 @@
         </w:pict>
       </w:r>
     </w:p>
-    <w:bookmarkEnd w:id="82"/>
-    <w:bookmarkStart w:id="83" w:name="mini-chequeo-3"/>
+    <w:bookmarkEnd w:id="81"/>
+    <w:bookmarkStart w:id="82" w:name="mini-chequeo-3"/>
     <w:p>
       <w:pPr>
         <w:pStyle w:val="Heading2"/>
@@ -8519,7 +8605,7 @@
         </w:numPr>
       </w:pPr>
       <w:r>
-        <w:t xml:space="preserve">Enuncia los 6 pasos esenciales del crimpado (pelar, ordenar, cortar, insertar, crimpar, comprobar).</w:t>
+        <w:t xml:space="preserve">Enuncia los 6 pasos esenciales del crimpado.</w:t>
       </w:r>
     </w:p>
     <w:p>
@@ -8729,8 +8815,8 @@
         </w:pict>
       </w:r>
     </w:p>
-    <w:bookmarkEnd w:id="83"/>
-    <w:bookmarkStart w:id="84" w:name="resumen-en-3-frases-3"/>
+    <w:bookmarkEnd w:id="82"/>
+    <w:bookmarkStart w:id="83" w:name="resumen-en-3-frases-3"/>
     <w:p>
       <w:pPr>
         <w:pStyle w:val="Heading2"/>
@@ -8814,8 +8900,8 @@
         <w:t xml:space="preserve">: el split pair y los problemas de interferencia requieren un ojo entrenado o un certificador.</w:t>
       </w:r>
     </w:p>
-    <w:bookmarkEnd w:id="84"/>
-    <w:bookmarkStart w:id="85" w:name="vocabulario-rápido-3"/>
+    <w:bookmarkEnd w:id="83"/>
+    <w:bookmarkStart w:id="84" w:name="vocabulario-rápido-3"/>
     <w:p>
       <w:pPr>
         <w:pStyle w:val="Heading2"/>
@@ -9000,7 +9086,7 @@
       <w:r>
         <w:t xml:space="preserve"> </w:t>
       </w:r>
-      <w:hyperlink r:id="rId40">
+      <w:hyperlink r:id="rId39">
         <w:r>
           <w:rPr>
             <w:rStyle w:val="Hyperlink"/>
@@ -9063,9 +9149,9 @@
         </w:r>
       </w:hyperlink>
     </w:p>
+    <w:bookmarkEnd w:id="84"/>
     <w:bookmarkEnd w:id="85"/>
-    <w:bookmarkEnd w:id="86"/>
-    <w:bookmarkStart w:id="102" w:name="fibra-óptica"/>
+    <w:bookmarkStart w:id="101" w:name="fibra-óptica"/>
     <w:p>
       <w:pPr>
         <w:pStyle w:val="Heading1"/>
@@ -9129,7 +9215,7 @@
         </w:pict>
       </w:r>
     </w:p>
-    <w:bookmarkStart w:id="87" w:name="la-idea-en-una-frase-4"/>
+    <w:bookmarkStart w:id="86" w:name="la-idea-en-una-frase-4"/>
     <w:p>
       <w:pPr>
         <w:pStyle w:val="Heading2"/>
@@ -9219,8 +9305,8 @@
         </w:pict>
       </w:r>
     </w:p>
-    <w:bookmarkEnd w:id="87"/>
-    <w:bookmarkStart w:id="88" w:name="ventajas-frente-al-cobre"/>
+    <w:bookmarkEnd w:id="86"/>
+    <w:bookmarkStart w:id="87" w:name="ventajas-frente-al-cobre"/>
     <w:p>
       <w:pPr>
         <w:pStyle w:val="Heading2"/>
@@ -9290,7 +9376,7 @@
               <w:pStyle w:val="Compact"/>
             </w:pPr>
             <w:r>
-              <w:t xml:space="preserve">Hasta 400 Gbps y más; el cobre se asfixia en 10</w:t>
+              <w:t xml:space="preserve">Hasta 400 Gbps y más; el cobre se queda en 25-40 Gbps (Cat8) y solo a 30 m</w:t>
             </w:r>
           </w:p>
         </w:tc>
@@ -9391,7 +9477,7 @@
                 <w:b/>
                 <w:bCs/>
               </w:rPr>
-              <w:t xml:space="preserve">Peso y envergadura</w:t>
+              <w:t xml:space="preserve">Peso y tamaño</w:t>
             </w:r>
           </w:p>
         </w:tc>
@@ -9436,8 +9522,8 @@
         </w:pict>
       </w:r>
     </w:p>
-    <w:bookmarkEnd w:id="88"/>
-    <w:bookmarkStart w:id="92" w:name="monomodo-smf-vs-multimodo-mmf"/>
+    <w:bookmarkEnd w:id="87"/>
+    <w:bookmarkStart w:id="91" w:name="monomodo-smf-vs-multimodo-mmf"/>
     <w:p>
       <w:pPr>
         <w:pStyle w:val="Heading2"/>
@@ -9568,7 +9654,7 @@
               <w:pStyle w:val="Compact"/>
             </w:pPr>
             <w:r>
-              <w:t xml:space="preserve">LED</w:t>
+              <w:t xml:space="preserve">LED (OM1/OM2) o VCSEL (OM3/OM4)</w:t>
             </w:r>
           </w:p>
         </w:tc>
@@ -9603,7 +9689,7 @@
               <w:pStyle w:val="Compact"/>
             </w:pPr>
             <w:r>
-              <w:t xml:space="preserve">550 m (a 10 Gbps)</w:t>
+              <w:t xml:space="preserve">550 m (OM4; OM3 llega a 300 m)</w:t>
             </w:r>
           </w:p>
         </w:tc>
@@ -9722,12 +9808,12 @@
           <wp:inline>
             <wp:extent cx="5334000" cy="3129280"/>
             <wp:effectExtent b="0" l="0" r="0" t="0"/>
-            <wp:docPr descr="Fibra monomodo (SMF) vs multimodo (MMF): núcleo, fuente de luz, distancia y coste" title="" id="90" name="Picture"/>
+            <wp:docPr descr="Fibra monomodo (SMF) vs multimodo (MMF): núcleo, fuente de luz, distancia y coste" title="" id="89" name="Picture"/>
             <a:graphic>
               <a:graphicData uri="http://schemas.openxmlformats.org/drawingml/2006/picture">
                 <pic:pic>
                   <pic:nvPicPr>
-                    <pic:cNvPr descr="public/diagrams/u02-fibra-smf-mmf.svg" id="91" name="Picture"/>
+                    <pic:cNvPr descr="public/diagrams/u02-fibra-smf-mmf.svg" id="90" name="Picture"/>
                     <pic:cNvPicPr>
                       <a:picLocks noChangeArrowheads="1" noChangeAspect="1"/>
                     </pic:cNvPicPr>
@@ -9739,7 +9825,7 @@
                           <a14:useLocalDpi xmlns:a14="http://schemas.microsoft.com/office/drawing/2010/main" val="0"/>
                         </a:ext>
                         <a:ext uri="{96DAC541-7B7A-43D3-8B79-37D633B846F1}">
-                          <asvg:svgBlip xmlns:asvg="http://schemas.microsoft.com/office/drawing/2016/SVG/main" r:embed="rId89"/>
+                          <asvg:svgBlip xmlns:asvg="http://schemas.microsoft.com/office/drawing/2016/SVG/main" r:embed="rId88"/>
                         </a:ext>
                       </a:extLst>
                     </a:blip>
@@ -9784,8 +9870,8 @@
         </w:pict>
       </w:r>
     </w:p>
-    <w:bookmarkEnd w:id="92"/>
-    <w:bookmarkStart w:id="96" w:name="conectores-de-fibra"/>
+    <w:bookmarkEnd w:id="91"/>
+    <w:bookmarkStart w:id="95" w:name="conectores-de-fibra"/>
     <w:p>
       <w:pPr>
         <w:pStyle w:val="Heading2"/>
@@ -10057,18 +10143,18 @@
           <wp:inline>
             <wp:extent cx="5334000" cy="3556000"/>
             <wp:effectExtent b="0" l="0" r="0" t="0"/>
-            <wp:docPr descr="Conectores de fibra óptica de colores en un panel de datos" title="" id="94" name="Picture"/>
+            <wp:docPr descr="Conectores de fibra óptica de colores en un panel de datos" title="" id="93" name="Picture"/>
             <a:graphic>
               <a:graphicData uri="http://schemas.openxmlformats.org/drawingml/2006/picture">
                 <pic:pic>
                   <pic:nvPicPr>
-                    <pic:cNvPr descr="public/photos/u02-fibra-conectores.jpg" id="95" name="Picture"/>
+                    <pic:cNvPr descr="public/photos/u02-fibra-conectores.jpg" id="94" name="Picture"/>
                     <pic:cNvPicPr>
                       <a:picLocks noChangeArrowheads="1" noChangeAspect="1"/>
                     </pic:cNvPicPr>
                   </pic:nvPicPr>
                   <pic:blipFill>
-                    <a:blip r:embed="rId93"/>
+                    <a:blip r:embed="rId92"/>
                     <a:stretch>
                       <a:fillRect/>
                     </a:stretch>
@@ -10110,8 +10196,8 @@
         </w:pict>
       </w:r>
     </w:p>
-    <w:bookmarkEnd w:id="96"/>
-    <w:bookmarkStart w:id="97" w:name="sfp-el-puerto-que-cambia-de-piel"/>
+    <w:bookmarkEnd w:id="95"/>
+    <w:bookmarkStart w:id="96" w:name="sfp-el-puerto-que-cambia-de-piel"/>
     <w:p>
       <w:pPr>
         <w:pStyle w:val="Heading2"/>
@@ -10360,8 +10446,8 @@
         </w:pict>
       </w:r>
     </w:p>
-    <w:bookmarkEnd w:id="97"/>
-    <w:bookmarkStart w:id="98" w:name="clases-de-fibra-las-siglas-om-y-os"/>
+    <w:bookmarkEnd w:id="96"/>
+    <w:bookmarkStart w:id="97" w:name="clases-de-fibra-las-siglas-om-y-os"/>
     <w:p>
       <w:pPr>
         <w:pStyle w:val="Heading2"/>
@@ -10683,7 +10769,7 @@
         <w:t xml:space="preserve">“lejos”</w:t>
       </w:r>
       <w:r>
-        <w:t xml:space="preserve">. Todo lo demás son clases con migas o legacy.</w:t>
+        <w:t xml:space="preserve">. Todo lo demás son clases antiguas o de gama baja.</w:t>
       </w:r>
     </w:p>
     <w:p>
@@ -10693,8 +10779,8 @@
         </w:pict>
       </w:r>
     </w:p>
-    <w:bookmarkEnd w:id="98"/>
-    <w:bookmarkStart w:id="99" w:name="mini-chequeo-4"/>
+    <w:bookmarkEnd w:id="97"/>
+    <w:bookmarkStart w:id="98" w:name="mini-chequeo-4"/>
     <w:p>
       <w:pPr>
         <w:pStyle w:val="Heading2"/>
@@ -10871,8 +10957,8 @@
         </w:pict>
       </w:r>
     </w:p>
-    <w:bookmarkEnd w:id="99"/>
-    <w:bookmarkStart w:id="100" w:name="resumen-en-3-frases-4"/>
+    <w:bookmarkEnd w:id="98"/>
+    <w:bookmarkStart w:id="99" w:name="resumen-en-3-frases-4"/>
     <w:p>
       <w:pPr>
         <w:pStyle w:val="Heading2"/>
@@ -10972,8 +11058,8 @@
         <w:t xml:space="preserve">hacen que un mismo puerto de switch sea de cobre o de fibra según el módulo: flexibilidad que el cobre no tiene.</w:t>
       </w:r>
     </w:p>
-    <w:bookmarkEnd w:id="100"/>
-    <w:bookmarkStart w:id="101" w:name="vocabulario-rápido-4"/>
+    <w:bookmarkEnd w:id="99"/>
+    <w:bookmarkStart w:id="100" w:name="vocabulario-rápido-4"/>
     <w:p>
       <w:pPr>
         <w:pStyle w:val="Heading2"/>
@@ -11206,7 +11292,7 @@
       <w:r>
         <w:t xml:space="preserve"> </w:t>
       </w:r>
-      <w:hyperlink r:id="rId40">
+      <w:hyperlink r:id="rId39">
         <w:r>
           <w:rPr>
             <w:rStyle w:val="Hyperlink"/>
@@ -11269,9 +11355,9 @@
         </w:r>
       </w:hyperlink>
     </w:p>
+    <w:bookmarkEnd w:id="100"/>
     <w:bookmarkEnd w:id="101"/>
-    <w:bookmarkEnd w:id="102"/>
-    <w:bookmarkStart w:id="116" w:name="conceptos-físicos-clave"/>
+    <w:bookmarkStart w:id="115" w:name="conceptos-físicos-clave"/>
     <w:p>
       <w:pPr>
         <w:pStyle w:val="Heading1"/>
@@ -11335,7 +11421,7 @@
         </w:pict>
       </w:r>
     </w:p>
-    <w:bookmarkStart w:id="103" w:name="la-idea-en-una-frase-5"/>
+    <w:bookmarkStart w:id="102" w:name="la-idea-en-una-frase-5"/>
     <w:p>
       <w:pPr>
         <w:pStyle w:val="Heading2"/>
@@ -11358,7 +11444,7 @@
         <w:t xml:space="preserve">“va rápido o va lento”</w:t>
       </w:r>
       <w:r>
-        <w:t xml:space="preserve">: se gobierna con</w:t>
+        <w:t xml:space="preserve">: se rige con</w:t>
       </w:r>
       <w:r>
         <w:t xml:space="preserve"> </w:t>
@@ -11487,8 +11573,8 @@
         </w:pict>
       </w:r>
     </w:p>
-    <w:bookmarkEnd w:id="103"/>
-    <w:bookmarkStart w:id="104" w:name="ancho-de-banda-la-capacidad-máxima"/>
+    <w:bookmarkEnd w:id="102"/>
+    <w:bookmarkStart w:id="103" w:name="ancho-de-banda-la-capacidad-máxima"/>
     <w:p>
       <w:pPr>
         <w:pStyle w:val="Heading2"/>
@@ -11641,8 +11727,8 @@
         </w:pict>
       </w:r>
     </w:p>
-    <w:bookmarkEnd w:id="104"/>
-    <w:bookmarkStart w:id="105" w:name="throughput-lo-que-de-verdad-te-llega"/>
+    <w:bookmarkEnd w:id="103"/>
+    <w:bookmarkStart w:id="104" w:name="throughput-lo-que-de-verdad-te-llega"/>
     <w:p>
       <w:pPr>
         <w:pStyle w:val="Heading2"/>
@@ -11798,8 +11884,8 @@
         </w:pict>
       </w:r>
     </w:p>
-    <w:bookmarkEnd w:id="105"/>
-    <w:bookmarkStart w:id="106" w:name="latencia-el-tiempo-de-viaje"/>
+    <w:bookmarkEnd w:id="104"/>
+    <w:bookmarkStart w:id="105" w:name="latencia-el-tiempo-de-viaje"/>
     <w:p>
       <w:pPr>
         <w:pStyle w:val="Heading2"/>
@@ -12050,8 +12136,8 @@
         </w:pict>
       </w:r>
     </w:p>
-    <w:bookmarkEnd w:id="106"/>
-    <w:bookmarkStart w:id="107" w:name="atenuación-la-señal-que-se-apaga"/>
+    <w:bookmarkEnd w:id="105"/>
+    <w:bookmarkStart w:id="106" w:name="atenuación-la-señal-que-se-apaga"/>
     <w:p>
       <w:pPr>
         <w:pStyle w:val="Heading2"/>
@@ -12122,14 +12208,14 @@
         </w:pict>
       </w:r>
     </w:p>
-    <w:bookmarkEnd w:id="107"/>
-    <w:bookmarkStart w:id="111" w:name="Xb0037806832f4a8a998f52142568f28f69b174f"/>
+    <w:bookmarkEnd w:id="106"/>
+    <w:bookmarkStart w:id="110" w:name="Xa7868012743c671470d756963497d1dbd911e20"/>
     <w:p>
       <w:pPr>
         <w:pStyle w:val="Heading2"/>
       </w:pPr>
       <w:r>
-        <w:t xml:space="preserve">📳 Diafonía (Crosstalk): luz de gas entre pares</w:t>
+        <w:t xml:space="preserve">📳 Diafonía (Crosstalk): cuando un par pisa a otro</w:t>
       </w:r>
     </w:p>
     <w:p>
@@ -12370,12 +12456,12 @@
           <wp:inline>
             <wp:extent cx="5334000" cy="3022600"/>
             <wp:effectExtent b="0" l="0" r="0" t="0"/>
-            <wp:docPr descr="Atenuación y diafonía en el cobre: señal que se debilita y pares que se pisan" title="" id="109" name="Picture"/>
+            <wp:docPr descr="Atenuación y diafonía en el cobre: señal que se debilita y pares que se pisan" title="" id="108" name="Picture"/>
             <a:graphic>
               <a:graphicData uri="http://schemas.openxmlformats.org/drawingml/2006/picture">
                 <pic:pic>
                   <pic:nvPicPr>
-                    <pic:cNvPr descr="public/diagrams/u02-atenuacion-crosstalk.svg" id="110" name="Picture"/>
+                    <pic:cNvPr descr="public/diagrams/u02-atenuacion-crosstalk.svg" id="109" name="Picture"/>
                     <pic:cNvPicPr>
                       <a:picLocks noChangeArrowheads="1" noChangeAspect="1"/>
                     </pic:cNvPicPr>
@@ -12387,7 +12473,7 @@
                           <a14:useLocalDpi xmlns:a14="http://schemas.microsoft.com/office/drawing/2010/main" val="0"/>
                         </a:ext>
                         <a:ext uri="{96DAC541-7B7A-43D3-8B79-37D633B846F1}">
-                          <asvg:svgBlip xmlns:asvg="http://schemas.microsoft.com/office/drawing/2016/SVG/main" r:embed="rId108"/>
+                          <asvg:svgBlip xmlns:asvg="http://schemas.microsoft.com/office/drawing/2016/SVG/main" r:embed="rId107"/>
                         </a:ext>
                       </a:extLst>
                     </a:blip>
@@ -12432,8 +12518,8 @@
         </w:pict>
       </w:r>
     </w:p>
-    <w:bookmarkEnd w:id="111"/>
-    <w:bookmarkStart w:id="112" w:name="X7d9f3bdf8e92db77be211cc27a2193b66425ba7"/>
+    <w:bookmarkEnd w:id="110"/>
+    <w:bookmarkStart w:id="111" w:name="X7d9f3bdf8e92db77be211cc27a2193b66425ba7"/>
     <w:p>
       <w:pPr>
         <w:pStyle w:val="Heading2"/>
@@ -12594,7 +12680,17 @@
               <w:pStyle w:val="Compact"/>
             </w:pPr>
             <w:r>
-              <w:t xml:space="preserve">Latencia alta (la variación, también llamada jitter)</w:t>
+              <w:rPr>
+                <w:b/>
+                <w:bCs/>
+              </w:rPr>
+              <w:t xml:space="preserve">Latencia</w:t>
+            </w:r>
+            <w:r>
+              <w:t xml:space="preserve"> </w:t>
+            </w:r>
+            <w:r>
+              <w:t xml:space="preserve">alta</w:t>
             </w:r>
           </w:p>
         </w:tc>
@@ -12721,8 +12817,8 @@
         </w:pict>
       </w:r>
     </w:p>
-    <w:bookmarkEnd w:id="112"/>
-    <w:bookmarkStart w:id="113" w:name="mini-chequeo-5"/>
+    <w:bookmarkEnd w:id="111"/>
+    <w:bookmarkStart w:id="112" w:name="mini-chequeo-5"/>
     <w:p>
       <w:pPr>
         <w:pStyle w:val="Heading2"/>
@@ -12893,8 +12989,8 @@
         </w:pict>
       </w:r>
     </w:p>
-    <w:bookmarkEnd w:id="113"/>
-    <w:bookmarkStart w:id="114" w:name="resumen-en-3-frases-5"/>
+    <w:bookmarkEnd w:id="112"/>
+    <w:bookmarkStart w:id="113" w:name="resumen-en-3-frases-5"/>
     <w:p>
       <w:pPr>
         <w:pStyle w:val="Heading2"/>
@@ -12998,8 +13094,8 @@
         <w:t xml:space="preserve">(NEXT, FEXT, PS NEXT) es la interferencia entre pares: el culpable oculto de muchos cables con errores intermitentes.</w:t>
       </w:r>
     </w:p>
-    <w:bookmarkEnd w:id="114"/>
-    <w:bookmarkStart w:id="115" w:name="vocabulario-rápido-5"/>
+    <w:bookmarkEnd w:id="113"/>
+    <w:bookmarkStart w:id="114" w:name="vocabulario-rápido-5"/>
     <w:p>
       <w:pPr>
         <w:pStyle w:val="Heading2"/>
@@ -13232,7 +13328,7 @@
       <w:r>
         <w:t xml:space="preserve"> </w:t>
       </w:r>
-      <w:hyperlink r:id="rId40">
+      <w:hyperlink r:id="rId39">
         <w:r>
           <w:rPr>
             <w:rStyle w:val="Hyperlink"/>
@@ -13295,9 +13391,9 @@
         </w:r>
       </w:hyperlink>
     </w:p>
+    <w:bookmarkEnd w:id="114"/>
     <w:bookmarkEnd w:id="115"/>
-    <w:bookmarkEnd w:id="116"/>
-    <w:bookmarkStart w:id="133" w:name="cableado-estructurado"/>
+    <w:bookmarkStart w:id="132" w:name="cableado-estructurado"/>
     <w:p>
       <w:pPr>
         <w:pStyle w:val="Heading1"/>
@@ -13361,7 +13457,7 @@
         </w:pict>
       </w:r>
     </w:p>
-    <w:bookmarkStart w:id="117" w:name="la-idea-en-una-frase-6"/>
+    <w:bookmarkStart w:id="116" w:name="la-idea-en-una-frase-6"/>
     <w:p>
       <w:pPr>
         <w:pStyle w:val="Heading2"/>
@@ -13451,7 +13547,7 @@
           <w:rPr>
             <w:rStyle w:val="Hyperlink"/>
           </w:rPr>
-          <w:t xml:space="preserve">punto 7</w:t>
+          <w:t xml:space="preserve">punto 6</w:t>
         </w:r>
       </w:hyperlink>
       <w:r>
@@ -13485,8 +13581,8 @@
         </w:pict>
       </w:r>
     </w:p>
-    <w:bookmarkEnd w:id="117"/>
-    <w:bookmarkStart w:id="118" w:name="el-estándar-tiaeia-568"/>
+    <w:bookmarkEnd w:id="116"/>
+    <w:bookmarkStart w:id="117" w:name="el-estándar-tiaeia-568"/>
     <w:p>
       <w:pPr>
         <w:pStyle w:val="Heading2"/>
@@ -13614,8 +13710,8 @@
         </w:pict>
       </w:r>
     </w:p>
-    <w:bookmarkEnd w:id="118"/>
-    <w:bookmarkStart w:id="122" w:name="el-recorrido-completo-de-la-señal"/>
+    <w:bookmarkEnd w:id="117"/>
+    <w:bookmarkStart w:id="121" w:name="el-recorrido-completo-de-la-señal"/>
     <w:p>
       <w:pPr>
         <w:pStyle w:val="Heading2"/>
@@ -13746,12 +13842,12 @@
           <wp:inline>
             <wp:extent cx="5334000" cy="3683000"/>
             <wp:effectExtent b="0" l="0" r="0" t="0"/>
-            <wp:docPr descr="Recorrido de la señal en cableado estructurado: de la PC al switch" title="" id="120" name="Picture"/>
+            <wp:docPr descr="Recorrido de la señal en cableado estructurado: de la PC al switch" title="" id="119" name="Picture"/>
             <a:graphic>
               <a:graphicData uri="http://schemas.openxmlformats.org/drawingml/2006/picture">
                 <pic:pic>
                   <pic:nvPicPr>
-                    <pic:cNvPr descr="public/diagrams/u02-recorrido-senal.svg" id="121" name="Picture"/>
+                    <pic:cNvPr descr="public/diagrams/u02-recorrido-senal.svg" id="120" name="Picture"/>
                     <pic:cNvPicPr>
                       <a:picLocks noChangeArrowheads="1" noChangeAspect="1"/>
                     </pic:cNvPicPr>
@@ -13763,7 +13859,7 @@
                           <a14:useLocalDpi xmlns:a14="http://schemas.microsoft.com/office/drawing/2010/main" val="0"/>
                         </a:ext>
                         <a:ext uri="{96DAC541-7B7A-43D3-8B79-37D633B846F1}">
-                          <asvg:svgBlip xmlns:asvg="http://schemas.microsoft.com/office/drawing/2016/SVG/main" r:embed="rId119"/>
+                          <asvg:svgBlip xmlns:asvg="http://schemas.microsoft.com/office/drawing/2016/SVG/main" r:embed="rId118"/>
                         </a:ext>
                       </a:extLst>
                     </a:blip>
@@ -13808,8 +13904,8 @@
         </w:pict>
       </w:r>
     </w:p>
-    <w:bookmarkEnd w:id="122"/>
-    <w:bookmarkStart w:id="126" w:name="los-cuatro-elementos"/>
+    <w:bookmarkEnd w:id="121"/>
+    <w:bookmarkStart w:id="125" w:name="los-cuatro-elementos"/>
     <w:p>
       <w:pPr>
         <w:pStyle w:val="Heading2"/>
@@ -14104,18 +14200,18 @@
           <wp:inline>
             <wp:extent cx="5334000" cy="3549689"/>
             <wp:effectExtent b="0" l="0" r="0" t="0"/>
-            <wp:docPr descr="Patch panel con latiguillos etiquetados en el rack" title="" id="124" name="Picture"/>
+            <wp:docPr descr="Patch panel con latiguillos etiquetados en el rack" title="" id="123" name="Picture"/>
             <a:graphic>
               <a:graphicData uri="http://schemas.openxmlformats.org/drawingml/2006/picture">
                 <pic:pic>
                   <pic:nvPicPr>
-                    <pic:cNvPr descr="public/photos/u02-patch-panel.jpg" id="125" name="Picture"/>
+                    <pic:cNvPr descr="public/photos/u02-patch-panel.jpg" id="124" name="Picture"/>
                     <pic:cNvPicPr>
                       <a:picLocks noChangeArrowheads="1" noChangeAspect="1"/>
                     </pic:cNvPicPr>
                   </pic:nvPicPr>
                   <pic:blipFill>
-                    <a:blip r:embed="rId123"/>
+                    <a:blip r:embed="rId122"/>
                     <a:stretch>
                       <a:fillRect/>
                     </a:stretch>
@@ -14181,8 +14277,8 @@
         </w:pict>
       </w:r>
     </w:p>
-    <w:bookmarkEnd w:id="126"/>
-    <w:bookmarkStart w:id="127" w:name="ventajas-de-hacerlo-bien"/>
+    <w:bookmarkEnd w:id="125"/>
+    <w:bookmarkStart w:id="126" w:name="ventajas-de-hacerlo-bien"/>
     <w:p>
       <w:pPr>
         <w:pStyle w:val="Heading2"/>
@@ -14377,8 +14473,8 @@
         </w:pict>
       </w:r>
     </w:p>
-    <w:bookmarkEnd w:id="127"/>
-    <w:bookmarkStart w:id="128" w:name="reglas-de-etiquetado-y-documentación"/>
+    <w:bookmarkEnd w:id="126"/>
+    <w:bookmarkStart w:id="127" w:name="reglas-de-etiquetado-y-documentación"/>
     <w:p>
       <w:pPr>
         <w:pStyle w:val="Heading2"/>
@@ -14513,8 +14609,8 @@
         </w:pict>
       </w:r>
     </w:p>
-    <w:bookmarkEnd w:id="128"/>
-    <w:bookmarkStart w:id="129" w:name="el-cableado-estructurado-vs-la-chapuza"/>
+    <w:bookmarkEnd w:id="127"/>
+    <w:bookmarkStart w:id="128" w:name="el-cableado-estructurado-vs-la-chapuza"/>
     <w:p>
       <w:pPr>
         <w:pStyle w:val="Heading2"/>
@@ -14577,7 +14673,7 @@
               <w:pStyle w:val="Compact"/>
             </w:pPr>
             <w:r>
-              <w:t xml:space="preserve">Cableado impro (directo a switch)</w:t>
+              <w:t xml:space="preserve">Cableado improvisado (directo de PC a switch)</w:t>
             </w:r>
           </w:p>
         </w:tc>
@@ -14790,7 +14886,7 @@
         <w:t xml:space="preserve"> </w:t>
       </w:r>
       <w:r>
-        <w:t xml:space="preserve">y se multiplica con cada cambio posterior. Y el rack sigue siendo afición limpia, que también cuenta.</w:t>
+        <w:t xml:space="preserve">y se multiplica con cada cambio posterior. Y un rack ordenado también es una satisfacción personal, que también cuenta.</w:t>
       </w:r>
     </w:p>
     <w:p>
@@ -14800,8 +14896,8 @@
         </w:pict>
       </w:r>
     </w:p>
-    <w:bookmarkEnd w:id="129"/>
-    <w:bookmarkStart w:id="130" w:name="mini-chequeo-6"/>
+    <w:bookmarkEnd w:id="128"/>
+    <w:bookmarkStart w:id="129" w:name="mini-chequeo-6"/>
     <w:p>
       <w:pPr>
         <w:pStyle w:val="Heading2"/>
@@ -14819,7 +14915,7 @@
         </w:numPr>
       </w:pPr>
       <w:r>
-        <w:t xml:space="preserve">Enumera los 4 componentes que separan un PC de un switch en cableado estructurado.</w:t>
+        <w:t xml:space="preserve">Enumera los 4 tipos de componente que recorre la señal del PC al switch (ojo, uno se repite).</w:t>
       </w:r>
     </w:p>
     <w:p>
@@ -14946,23 +15042,23 @@
         </w:numPr>
       </w:pPr>
       <w:r>
-        <w:t xml:space="preserve">Solo</w:t>
-      </w:r>
-      <w:r>
-        <w:t xml:space="preserve"> </w:t>
-      </w:r>
-      <w:r>
-        <w:rPr>
-          <w:b/>
-          <w:bCs/>
-        </w:rPr>
-        <w:t xml:space="preserve">moverse con un latiguillo nuevo</w:t>
-      </w:r>
-      <w:r>
-        <w:t xml:space="preserve"> </w:t>
-      </w:r>
-      <w:r>
-        <w:t xml:space="preserve">en el mismo punto de red, y si cambia de roseta, cambiar el latiguillo del patch panel al puerto correspondiente. La obra (cable horizontal) queda intacta: esa es la ventaja de separar lo fijo de lo flexible.</w:t>
+        <w:t xml:space="preserve">Nada de obra: se enchufa un</w:t>
+      </w:r>
+      <w:r>
+        <w:t xml:space="preserve"> </w:t>
+      </w:r>
+      <w:r>
+        <w:rPr>
+          <w:b/>
+          <w:bCs/>
+        </w:rPr>
+        <w:t xml:space="preserve">latiguillo nuevo</w:t>
+      </w:r>
+      <w:r>
+        <w:t xml:space="preserve"> </w:t>
+      </w:r>
+      <w:r>
+        <w:t xml:space="preserve">en la roseta de la mesa nueva y, si hace falta, se mueve en el rack el latiguillo al puerto del switch correspondiente. La obra (cable horizontal) queda intacta: esa es la ventaja de separar lo fijo de lo flexible.</w:t>
       </w:r>
     </w:p>
     <w:p>
@@ -14997,8 +15093,8 @@
         </w:pict>
       </w:r>
     </w:p>
-    <w:bookmarkEnd w:id="130"/>
-    <w:bookmarkStart w:id="131" w:name="resumen-en-3-frases-6"/>
+    <w:bookmarkEnd w:id="129"/>
+    <w:bookmarkStart w:id="130" w:name="resumen-en-3-frases-6"/>
     <w:p>
       <w:pPr>
         <w:pStyle w:val="Heading2"/>
@@ -15098,8 +15194,8 @@
         <w:t xml:space="preserve">a lo largo de la vida del edificio.</w:t>
       </w:r>
     </w:p>
-    <w:bookmarkEnd w:id="131"/>
-    <w:bookmarkStart w:id="132" w:name="vocabulario-rápido-6"/>
+    <w:bookmarkEnd w:id="130"/>
+    <w:bookmarkStart w:id="131" w:name="vocabulario-rápido-6"/>
     <w:p>
       <w:pPr>
         <w:pStyle w:val="Heading2"/>
@@ -15332,7 +15428,7 @@
       <w:r>
         <w:t xml:space="preserve"> </w:t>
       </w:r>
-      <w:hyperlink r:id="rId40">
+      <w:hyperlink r:id="rId39">
         <w:r>
           <w:rPr>
             <w:rStyle w:val="Hyperlink"/>
@@ -15395,9 +15491,9 @@
         </w:r>
       </w:hyperlink>
     </w:p>
+    <w:bookmarkEnd w:id="131"/>
     <w:bookmarkEnd w:id="132"/>
-    <w:bookmarkEnd w:id="133"/>
-    <w:bookmarkStart w:id="147" w:name="el-modelo-osi"/>
+    <w:bookmarkStart w:id="146" w:name="el-modelo-osi"/>
     <w:p>
       <w:pPr>
         <w:pStyle w:val="Heading1"/>
@@ -15461,7 +15557,7 @@
         </w:pict>
       </w:r>
     </w:p>
-    <w:bookmarkStart w:id="134" w:name="la-idea-en-una-frase-7"/>
+    <w:bookmarkStart w:id="133" w:name="la-idea-en-una-frase-7"/>
     <w:p>
       <w:pPr>
         <w:pStyle w:val="Heading2"/>
@@ -15559,8 +15655,8 @@
         </w:pict>
       </w:r>
     </w:p>
-    <w:bookmarkEnd w:id="134"/>
-    <w:bookmarkStart w:id="135" w:name="qué-es-el-modelo-osi"/>
+    <w:bookmarkEnd w:id="133"/>
+    <w:bookmarkStart w:id="134" w:name="qué-es-el-modelo-osi"/>
     <w:p>
       <w:pPr>
         <w:pStyle w:val="Heading2"/>
@@ -15673,8 +15769,8 @@
         </w:pict>
       </w:r>
     </w:p>
-    <w:bookmarkEnd w:id="135"/>
-    <w:bookmarkStart w:id="140" w:name="las-7-capas-de-arriba-a-abajo"/>
+    <w:bookmarkEnd w:id="134"/>
+    <w:bookmarkStart w:id="139" w:name="las-7-capas-de-arriba-a-abajo"/>
     <w:p>
       <w:pPr>
         <w:pStyle w:val="Heading2"/>
@@ -16274,7 +16370,7 @@
       <w:r>
         <w:t xml:space="preserve"> </w:t>
       </w:r>
-      <w:hyperlink r:id="rId136">
+      <w:hyperlink r:id="rId135">
         <w:r>
           <w:rPr>
             <w:rStyle w:val="Hyperlink"/>
@@ -16295,12 +16391,12 @@
           <wp:inline>
             <wp:extent cx="5334000" cy="3502766"/>
             <wp:effectExtent b="0" l="0" r="0" t="0"/>
-            <wp:docPr descr="Modelo OSI de 7 capas con la marca de dónde estamos: las capas 1 y 2" title="" id="138" name="Picture"/>
+            <wp:docPr descr="Modelo OSI de 7 capas con la marca de dónde estamos: las capas 1 y 2" title="" id="137" name="Picture"/>
             <a:graphic>
               <a:graphicData uri="http://schemas.openxmlformats.org/drawingml/2006/picture">
                 <pic:pic>
                   <pic:nvPicPr>
-                    <pic:cNvPr descr="public/diagrams/u02-modelo-osi.svg" id="139" name="Picture"/>
+                    <pic:cNvPr descr="public/diagrams/u02-modelo-osi.svg" id="138" name="Picture"/>
                     <pic:cNvPicPr>
                       <a:picLocks noChangeArrowheads="1" noChangeAspect="1"/>
                     </pic:cNvPicPr>
@@ -16312,7 +16408,7 @@
                           <a14:useLocalDpi xmlns:a14="http://schemas.microsoft.com/office/drawing/2010/main" val="0"/>
                         </a:ext>
                         <a:ext uri="{96DAC541-7B7A-43D3-8B79-37D633B846F1}">
-                          <asvg:svgBlip xmlns:asvg="http://schemas.microsoft.com/office/drawing/2016/SVG/main" r:embed="rId137"/>
+                          <asvg:svgBlip xmlns:asvg="http://schemas.microsoft.com/office/drawing/2016/SVG/main" r:embed="rId136"/>
                         </a:ext>
                       </a:extLst>
                     </a:blip>
@@ -16357,8 +16453,8 @@
         </w:pict>
       </w:r>
     </w:p>
-    <w:bookmarkEnd w:id="140"/>
-    <w:bookmarkStart w:id="142" w:name="dónde-estamos-en-el-mapa"/>
+    <w:bookmarkEnd w:id="139"/>
+    <w:bookmarkStart w:id="141" w:name="dónde-estamos-en-el-mapa"/>
     <w:p>
       <w:pPr>
         <w:pStyle w:val="Heading2"/>
@@ -16450,7 +16546,7 @@
       <w:r>
         <w:t xml:space="preserve"> </w:t>
       </w:r>
-      <w:hyperlink r:id="rId141">
+      <w:hyperlink r:id="rId140">
         <w:r>
           <w:rPr>
             <w:rStyle w:val="Hyperlink"/>
@@ -16682,8 +16778,8 @@
         </w:pict>
       </w:r>
     </w:p>
-    <w:bookmarkEnd w:id="142"/>
-    <w:bookmarkStart w:id="143" w:name="osi-teoría-vs-tcpip-la-realidad"/>
+    <w:bookmarkEnd w:id="141"/>
+    <w:bookmarkStart w:id="142" w:name="osi-teoría-vs-tcpip-la-realidad"/>
     <w:p>
       <w:pPr>
         <w:pStyle w:val="Heading2"/>
@@ -17159,8 +17255,8 @@
         </w:pict>
       </w:r>
     </w:p>
-    <w:bookmarkEnd w:id="143"/>
-    <w:bookmarkStart w:id="144" w:name="mini-chequeo-7"/>
+    <w:bookmarkEnd w:id="142"/>
+    <w:bookmarkStart w:id="143" w:name="mini-chequeo-7"/>
     <w:p>
       <w:pPr>
         <w:pStyle w:val="Heading2"/>
@@ -17214,7 +17310,7 @@
         </w:numPr>
       </w:pPr>
       <w:r>
-        <w:t xml:space="preserve">¿ OSI y TCP/IP son protocolos o modelos? ¿Cuál se usa de verdad en Internet?</w:t>
+        <w:t xml:space="preserve">¿OSI y TCP/IP son protocolos o modelos? ¿Cuál se usa de verdad en Internet?</w:t>
       </w:r>
     </w:p>
     <w:p>
@@ -17327,8 +17423,8 @@
         </w:pict>
       </w:r>
     </w:p>
-    <w:bookmarkEnd w:id="144"/>
-    <w:bookmarkStart w:id="145" w:name="resumen-en-3-frases-7"/>
+    <w:bookmarkEnd w:id="143"/>
+    <w:bookmarkStart w:id="144" w:name="resumen-en-3-frases-7"/>
     <w:p>
       <w:pPr>
         <w:pStyle w:val="Heading2"/>
@@ -17442,8 +17538,8 @@
         <w:t xml:space="preserve">; la IP y las rutas son capa 3 (más adelante).</w:t>
       </w:r>
     </w:p>
-    <w:bookmarkEnd w:id="145"/>
-    <w:bookmarkStart w:id="146" w:name="vocabulario-rápido-7"/>
+    <w:bookmarkEnd w:id="144"/>
+    <w:bookmarkStart w:id="145" w:name="vocabulario-rápido-7"/>
     <w:p>
       <w:pPr>
         <w:pStyle w:val="Heading2"/>
@@ -17651,7 +17747,7 @@
       <w:r>
         <w:t xml:space="preserve"> </w:t>
       </w:r>
-      <w:hyperlink r:id="rId40">
+      <w:hyperlink r:id="rId39">
         <w:r>
           <w:rPr>
             <w:rStyle w:val="Hyperlink"/>
@@ -17714,9 +17810,9 @@
         </w:r>
       </w:hyperlink>
     </w:p>
+    <w:bookmarkEnd w:id="145"/>
     <w:bookmarkEnd w:id="146"/>
-    <w:bookmarkEnd w:id="147"/>
-    <w:bookmarkStart w:id="161" w:name="la-trama-ethernet"/>
+    <w:bookmarkStart w:id="160" w:name="la-trama-ethernet"/>
     <w:p>
       <w:pPr>
         <w:pStyle w:val="Heading1"/>
@@ -17780,7 +17876,7 @@
         </w:pict>
       </w:r>
     </w:p>
-    <w:bookmarkStart w:id="148" w:name="la-idea-en-una-frase-8"/>
+    <w:bookmarkStart w:id="147" w:name="la-idea-en-una-frase-8"/>
     <w:p>
       <w:pPr>
         <w:pStyle w:val="Heading2"/>
@@ -17928,21 +18024,7 @@
         <w:t xml:space="preserve"> </w:t>
       </w:r>
       <w:r>
-        <w:t xml:space="preserve">viste que la capa 2 entrega en la red local. Aquí abrimos ese sobre como si fuera la ficha técnica que luego verás en</w:t>
-      </w:r>
-      <w:r>
-        <w:t xml:space="preserve"> </w:t>
-      </w:r>
-      <w:hyperlink r:id="rId26">
-        <w:r>
-          <w:rPr>
-            <w:rStyle w:val="Hyperlink"/>
-          </w:rPr>
-          <w:t xml:space="preserve">Wireshark</w:t>
-        </w:r>
-      </w:hyperlink>
-      <w:r>
-        <w:t xml:space="preserve">.</w:t>
+        <w:t xml:space="preserve">viste que la capa 2 entrega en la red local. Aquí abrimos ese sobre campo a campo, como si fuera su ficha técnica, y al final del punto lo abres de verdad con Wireshark.</w:t>
       </w:r>
     </w:p>
     <w:p>
@@ -17952,8 +18034,8 @@
         </w:pict>
       </w:r>
     </w:p>
-    <w:bookmarkEnd w:id="148"/>
-    <w:bookmarkStart w:id="149" w:name="de-bits-a-trama-capa-1-capa-2"/>
+    <w:bookmarkEnd w:id="147"/>
+    <w:bookmarkStart w:id="148" w:name="de-bits-a-trama-capa-1-capa-2"/>
     <w:p>
       <w:pPr>
         <w:pStyle w:val="Heading2"/>
@@ -18144,8 +18226,8 @@
         </w:pict>
       </w:r>
     </w:p>
-    <w:bookmarkEnd w:id="149"/>
-    <w:bookmarkStart w:id="154" w:name="Xa6233ec4034fce4ef2691de5233630fb892c42d"/>
+    <w:bookmarkEnd w:id="148"/>
+    <w:bookmarkStart w:id="153" w:name="Xa6233ec4034fce4ef2691de5233630fb892c42d"/>
     <w:p>
       <w:pPr>
         <w:pStyle w:val="Heading2"/>
@@ -18527,7 +18609,7 @@
               <w:pStyle w:val="Compact"/>
             </w:pPr>
             <w:r>
-              <w:t xml:space="preserve">El</w:t>
+              <w:t xml:space="preserve">La</w:t>
             </w:r>
             <w:r>
               <w:t xml:space="preserve"> </w:t>
@@ -18660,7 +18742,7 @@
       <w:r>
         <w:t xml:space="preserve"> </w:t>
       </w:r>
-      <w:hyperlink r:id="rId150">
+      <w:hyperlink r:id="rId149">
         <w:r>
           <w:rPr>
             <w:rStyle w:val="Hyperlink"/>
@@ -18769,7 +18851,7 @@
       <w:r>
         <w:t xml:space="preserve"> </w:t>
       </w:r>
-      <w:hyperlink r:id="rId150">
+      <w:hyperlink r:id="rId149">
         <w:r>
           <w:rPr>
             <w:rStyle w:val="Hyperlink"/>
@@ -18803,12 +18885,12 @@
           <wp:inline>
             <wp:extent cx="5334000" cy="3091542"/>
             <wp:effectExtent b="0" l="0" r="0" t="0"/>
-            <wp:docPr descr="Trama Ethernet (Ethernet II): MACs, EtherType, payload y FCS" title="" id="152" name="Picture"/>
+            <wp:docPr descr="Trama Ethernet (Ethernet II): MACs, EtherType, payload y FCS" title="" id="151" name="Picture"/>
             <a:graphic>
               <a:graphicData uri="http://schemas.openxmlformats.org/drawingml/2006/picture">
                 <pic:pic>
                   <pic:nvPicPr>
-                    <pic:cNvPr descr="public/diagrams/u02-trama-ethernet.svg" id="153" name="Picture"/>
+                    <pic:cNvPr descr="public/diagrams/u02-trama-ethernet.svg" id="152" name="Picture"/>
                     <pic:cNvPicPr>
                       <a:picLocks noChangeArrowheads="1" noChangeAspect="1"/>
                     </pic:cNvPicPr>
@@ -18820,7 +18902,7 @@
                           <a14:useLocalDpi xmlns:a14="http://schemas.microsoft.com/office/drawing/2010/main" val="0"/>
                         </a:ext>
                         <a:ext uri="{96DAC541-7B7A-43D3-8B79-37D633B846F1}">
-                          <asvg:svgBlip xmlns:asvg="http://schemas.microsoft.com/office/drawing/2016/SVG/main" r:embed="rId151"/>
+                          <asvg:svgBlip xmlns:asvg="http://schemas.microsoft.com/office/drawing/2016/SVG/main" r:embed="rId150"/>
                         </a:ext>
                       </a:extLst>
                     </a:blip>
@@ -18942,8 +19024,8 @@
         </w:pict>
       </w:r>
     </w:p>
-    <w:bookmarkEnd w:id="154"/>
-    <w:bookmarkStart w:id="156" w:name="la-trama-en-el-aire-medios-no-guiados"/>
+    <w:bookmarkEnd w:id="153"/>
+    <w:bookmarkStart w:id="155" w:name="la-trama-en-el-aire-medios-no-guiados"/>
     <w:p>
       <w:pPr>
         <w:pStyle w:val="Heading2"/>
@@ -19259,13 +19341,29 @@
                 <w:i/>
                 <w:iCs/>
               </w:rPr>
-              <w:t xml:space="preserve">Type / Length</w:t>
+              <w:t xml:space="preserve">Type/Subtype</w:t>
             </w:r>
             <w:r>
               <w:t xml:space="preserve"> </w:t>
             </w:r>
             <w:r>
-              <w:t xml:space="preserve">y tipos de trama (datos, management…)</w:t>
+              <w:t xml:space="preserve">del</w:t>
+            </w:r>
+            <w:r>
+              <w:t xml:space="preserve"> </w:t>
+            </w:r>
+            <w:r>
+              <w:rPr>
+                <w:i/>
+                <w:iCs/>
+              </w:rPr>
+              <w:t xml:space="preserve">Frame Control</w:t>
+            </w:r>
+            <w:r>
+              <w:t xml:space="preserve"> </w:t>
+            </w:r>
+            <w:r>
+              <w:t xml:space="preserve">(datos, management, control…)</w:t>
             </w:r>
           </w:p>
         </w:tc>
@@ -19413,7 +19511,7 @@
       <w:r>
         <w:t xml:space="preserve"> </w:t>
       </w:r>
-      <w:hyperlink r:id="rId155">
+      <w:hyperlink r:id="rId154">
         <w:r>
           <w:rPr>
             <w:rStyle w:val="Hyperlink"/>
@@ -19445,8 +19543,8 @@
         </w:pict>
       </w:r>
     </w:p>
-    <w:bookmarkEnd w:id="156"/>
-    <w:bookmarkStart w:id="157" w:name="cómo-lo-ves-en-vivo-wireshark"/>
+    <w:bookmarkEnd w:id="155"/>
+    <w:bookmarkStart w:id="156" w:name="cómo-lo-ves-en-vivo-wireshark"/>
     <w:p>
       <w:pPr>
         <w:pStyle w:val="Heading2"/>
@@ -19630,8 +19728,8 @@
         </w:pict>
       </w:r>
     </w:p>
-    <w:bookmarkEnd w:id="157"/>
-    <w:bookmarkStart w:id="158" w:name="mini-chequeo-8"/>
+    <w:bookmarkEnd w:id="156"/>
+    <w:bookmarkStart w:id="157" w:name="mini-chequeo-8"/>
     <w:p>
       <w:pPr>
         <w:pStyle w:val="Heading2"/>
@@ -19851,8 +19949,8 @@
         </w:pict>
       </w:r>
     </w:p>
-    <w:bookmarkEnd w:id="158"/>
-    <w:bookmarkStart w:id="159" w:name="resumen-en-3-frases-8"/>
+    <w:bookmarkEnd w:id="157"/>
+    <w:bookmarkStart w:id="158" w:name="resumen-en-3-frases-8"/>
     <w:p>
       <w:pPr>
         <w:pStyle w:val="Heading2"/>
@@ -19997,8 +20095,8 @@
         <w:t xml:space="preserve">El EtherType etiqueta el contenido (IPv4, IPv6, ARP…); ARP se estudia a fondo en la unidad de dirección IP.</w:t>
       </w:r>
     </w:p>
-    <w:bookmarkEnd w:id="159"/>
-    <w:bookmarkStart w:id="160" w:name="vocabulario-rápido-8"/>
+    <w:bookmarkEnd w:id="158"/>
+    <w:bookmarkStart w:id="159" w:name="vocabulario-rápido-8"/>
     <w:p>
       <w:pPr>
         <w:pStyle w:val="Heading2"/>
@@ -20216,7 +20314,7 @@
       <w:r>
         <w:t xml:space="preserve"> </w:t>
       </w:r>
-      <w:hyperlink r:id="rId40">
+      <w:hyperlink r:id="rId39">
         <w:r>
           <w:rPr>
             <w:rStyle w:val="Hyperlink"/>
@@ -20279,9 +20377,9 @@
         </w:r>
       </w:hyperlink>
     </w:p>
+    <w:bookmarkEnd w:id="159"/>
     <w:bookmarkEnd w:id="160"/>
-    <w:bookmarkEnd w:id="161"/>
-    <w:bookmarkStart w:id="174" w:name="cierre-consolida-lo-aprendido"/>
+    <w:bookmarkStart w:id="173" w:name="cierre-consolida-lo-aprendido"/>
     <w:p>
       <w:pPr>
         <w:pStyle w:val="Heading1"/>
@@ -20377,7 +20475,7 @@
         </w:pict>
       </w:r>
     </w:p>
-    <w:bookmarkStart w:id="162" w:name="sé-el-bit"/>
+    <w:bookmarkStart w:id="161" w:name="sé-el-bit"/>
     <w:p>
       <w:pPr>
         <w:pStyle w:val="Heading2"/>
@@ -20631,8 +20729,8 @@
         </w:pict>
       </w:r>
     </w:p>
-    <w:bookmarkEnd w:id="162"/>
-    <w:bookmarkStart w:id="163" w:name="fireside-chat-cobre-vs-fibra"/>
+    <w:bookmarkEnd w:id="161"/>
+    <w:bookmarkStart w:id="162" w:name="fireside-chat-cobre-vs-fibra"/>
     <w:p>
       <w:pPr>
         <w:pStyle w:val="Heading2"/>
@@ -20969,8 +21067,8 @@
         </w:pict>
       </w:r>
     </w:p>
-    <w:bookmarkEnd w:id="163"/>
-    <w:bookmarkStart w:id="164" w:name="quién-soy"/>
+    <w:bookmarkEnd w:id="162"/>
+    <w:bookmarkStart w:id="163" w:name="quién-soy"/>
     <w:p>
       <w:pPr>
         <w:pStyle w:val="Heading2"/>
@@ -21192,8 +21290,8 @@
         </w:pict>
       </w:r>
     </w:p>
-    <w:bookmarkEnd w:id="164"/>
-    <w:bookmarkStart w:id="165" w:name="Xc775dd408edefa1e4319b2d9518478d03e3b6ba"/>
+    <w:bookmarkEnd w:id="163"/>
+    <w:bookmarkStart w:id="164" w:name="Xc775dd408edefa1e4319b2d9518478d03e3b6ba"/>
     <w:p>
       <w:pPr>
         <w:pStyle w:val="Heading2"/>
@@ -21223,7 +21321,23 @@
         <w:t xml:space="preserve"> </w:t>
       </w:r>
       <w:r>
-        <w:t xml:space="preserve">— Me encanta este clásico. Usuario:</w:t>
+        <w:t xml:space="preserve">— Me encanta este clásico.</w:t>
+      </w:r>
+      <w:r>
+        <w:t xml:space="preserve"> </w:t>
+      </w:r>
+      <w:r>
+        <w:rPr>
+          <w:b/>
+          <w:bCs/>
+        </w:rPr>
+        <w:t xml:space="preserve">Usuario:</w:t>
+      </w:r>
+      <w:r>
+        <w:t xml:space="preserve"> </w:t>
+      </w:r>
+      <w:r>
+        <w:t xml:space="preserve">—</w:t>
       </w:r>
       <w:r>
         <w:t xml:space="preserve"> </w:t>
@@ -21233,10 +21347,23 @@
           <w:i/>
           <w:iCs/>
         </w:rPr>
-        <w:t xml:space="preserve">El LED del switch se enciende, así que el cable funciona</w:t>
-      </w:r>
-      <w:r>
-        <w:t xml:space="preserve">. CONRAD:</w:t>
+        <w:t xml:space="preserve">El LED del switch se enciende, así que el cable funciona.</w:t>
+      </w:r>
+      <w:r>
+        <w:t xml:space="preserve"> </w:t>
+      </w:r>
+      <w:r>
+        <w:rPr>
+          <w:b/>
+          <w:bCs/>
+        </w:rPr>
+        <w:t xml:space="preserve">CONRAD:</w:t>
+      </w:r>
+      <w:r>
+        <w:t xml:space="preserve"> </w:t>
+      </w:r>
+      <w:r>
+        <w:t xml:space="preserve">—</w:t>
       </w:r>
       <w:r>
         <w:t xml:space="preserve"> </w:t>
@@ -21418,8 +21545,8 @@
         </w:pict>
       </w:r>
     </w:p>
-    <w:bookmarkEnd w:id="165"/>
-    <w:bookmarkStart w:id="166" w:name="X8761c630f505b3d8996577ee9d4574070c69e44"/>
+    <w:bookmarkEnd w:id="164"/>
+    <w:bookmarkStart w:id="165" w:name="X8761c630f505b3d8996577ee9d4574070c69e44"/>
     <w:p>
       <w:pPr>
         <w:pStyle w:val="Heading2"/>
@@ -21721,8 +21848,8 @@
         </w:pict>
       </w:r>
     </w:p>
-    <w:bookmarkEnd w:id="166"/>
-    <w:bookmarkStart w:id="167" w:name="logros-de-esta-unidad"/>
+    <w:bookmarkEnd w:id="165"/>
+    <w:bookmarkStart w:id="166" w:name="logros-de-esta-unidad"/>
     <w:p>
       <w:pPr>
         <w:pStyle w:val="Heading2"/>
@@ -21913,8 +22040,8 @@
         </w:pict>
       </w:r>
     </w:p>
-    <w:bookmarkEnd w:id="167"/>
-    <w:bookmarkStart w:id="168" w:name="atrévete-a-pensar"/>
+    <w:bookmarkEnd w:id="166"/>
+    <w:bookmarkStart w:id="167" w:name="atrévete-a-pensar"/>
     <w:p>
       <w:pPr>
         <w:pStyle w:val="Heading2"/>
@@ -22154,8 +22281,8 @@
         </w:pict>
       </w:r>
     </w:p>
-    <w:bookmarkEnd w:id="168"/>
-    <w:bookmarkStart w:id="169" w:name="crucigrama-de-bits"/>
+    <w:bookmarkEnd w:id="167"/>
+    <w:bookmarkStart w:id="168" w:name="crucigrama-de-bits"/>
     <w:p>
       <w:pPr>
         <w:pStyle w:val="Heading2"/>
@@ -22181,7 +22308,7 @@
         <w:rPr>
           <w:rStyle w:val="VerbatimChar"/>
         </w:rPr>
-        <w:t xml:space="preserve">1. Conector de 8 pines para UTP (4 letras + número)</w:t>
+        <w:t xml:space="preserve">1. Conector de 8 pines para UTP (2 letras + número)</w:t>
       </w:r>
       <w:r>
         <w:br/>
@@ -22247,7 +22374,7 @@
         <w:rPr>
           <w:rStyle w:val="VerbatimChar"/>
         </w:rPr>
-        <w:t xml:space="preserve">3. Norma de crimpado con naranja primero (letra + número)</w:t>
+        <w:t xml:space="preserve">3. Norma de crimpado con naranja primero (letra, números y letra)</w:t>
       </w:r>
       <w:r>
         <w:br/>
@@ -22310,8 +22437,8 @@
         </w:pict>
       </w:r>
     </w:p>
-    <w:bookmarkEnd w:id="169"/>
-    <w:bookmarkStart w:id="170" w:name="preguntas-de-entrevista-de-trabajo"/>
+    <w:bookmarkEnd w:id="168"/>
+    <w:bookmarkStart w:id="169" w:name="preguntas-de-entrevista-de-trabajo"/>
     <w:p>
       <w:pPr>
         <w:pStyle w:val="Heading2"/>
@@ -22440,8 +22567,8 @@
         </w:pict>
       </w:r>
     </w:p>
-    <w:bookmarkEnd w:id="170"/>
-    <w:bookmarkStart w:id="171" w:name="no-hay-preguntas-tontas"/>
+    <w:bookmarkEnd w:id="169"/>
+    <w:bookmarkStart w:id="170" w:name="no-hay-preguntas-tontas"/>
     <w:p>
       <w:pPr>
         <w:pStyle w:val="Heading2"/>
@@ -22622,8 +22749,8 @@
         </w:pict>
       </w:r>
     </w:p>
-    <w:bookmarkEnd w:id="171"/>
-    <w:bookmarkStart w:id="172" w:name="poscréditos"/>
+    <w:bookmarkEnd w:id="170"/>
+    <w:bookmarkStart w:id="171" w:name="poscréditos"/>
     <w:p>
       <w:pPr>
         <w:pStyle w:val="Heading2"/>
@@ -22675,14 +22802,14 @@
         </w:pict>
       </w:r>
     </w:p>
-    <w:bookmarkEnd w:id="172"/>
-    <w:bookmarkStart w:id="173" w:name="criterios-de-evaluación-cubiertos-ra2"/>
+    <w:bookmarkEnd w:id="171"/>
+    <w:bookmarkStart w:id="172" w:name="Xe5c9652d70275eff18ae7b599d66bd50ec929a5"/>
     <w:p>
       <w:pPr>
         <w:pStyle w:val="Heading2"/>
       </w:pPr>
       <w:r>
-        <w:t xml:space="preserve">✅ Criterios de evaluación cubiertos (RA2)</w:t>
+        <w:t xml:space="preserve">✅ Criterios de evaluación cubiertos (RA1/RA2)</w:t>
       </w:r>
     </w:p>
     <w:p>
@@ -22755,29 +22882,29 @@
               <w:pStyle w:val="Compact"/>
             </w:pPr>
             <w:r>
-              <w:t xml:space="preserve">a)</w:t>
-            </w:r>
-          </w:p>
-        </w:tc>
-        <w:tc>
-          <w:tcPr/>
-          <w:p>
-            <w:pPr>
-              <w:pStyle w:val="Compact"/>
-            </w:pPr>
-            <w:r>
-              <w:t xml:space="preserve">Estándares para redes cableadas</w:t>
-            </w:r>
-          </w:p>
-        </w:tc>
-        <w:tc>
-          <w:tcPr/>
-          <w:p>
-            <w:pPr>
-              <w:pStyle w:val="Compact"/>
-            </w:pPr>
-            <w:r>
-              <w:t xml:space="preserve">✅ Categorías, T568A/B, Auto MDI-X (puntos 2-3)</w:t>
+              <w:t xml:space="preserve">RA1·b)</w:t>
+            </w:r>
+          </w:p>
+        </w:tc>
+        <w:tc>
+          <w:tcPr/>
+          <w:p>
+            <w:pPr>
+              <w:pStyle w:val="Compact"/>
+            </w:pPr>
+            <w:r>
+              <w:t xml:space="preserve">Medios de transmisión</w:t>
+            </w:r>
+          </w:p>
+        </w:tc>
+        <w:tc>
+          <w:tcPr/>
+          <w:p>
+            <w:pPr>
+              <w:pStyle w:val="Compact"/>
+            </w:pPr>
+            <w:r>
+              <w:t xml:space="preserve">✅ Puntos 1, 2 y 5</w:t>
             </w:r>
           </w:p>
         </w:tc>
@@ -22790,29 +22917,29 @@
               <w:pStyle w:val="Compact"/>
             </w:pPr>
             <w:r>
-              <w:t xml:space="preserve">b)</w:t>
-            </w:r>
-          </w:p>
-        </w:tc>
-        <w:tc>
-          <w:tcPr/>
-          <w:p>
-            <w:pPr>
-              <w:pStyle w:val="Compact"/>
-            </w:pPr>
-            <w:r>
-              <w:t xml:space="preserve">Montaje de cables</w:t>
-            </w:r>
-          </w:p>
-        </w:tc>
-        <w:tc>
-          <w:tcPr/>
-          <w:p>
-            <w:pPr>
-              <w:pStyle w:val="Compact"/>
-            </w:pPr>
-            <w:r>
-              <w:t xml:space="preserve">✅ Laboratorio de crimpado (⚡)</w:t>
+              <w:t xml:space="preserve">RA2·a)</w:t>
+            </w:r>
+          </w:p>
+        </w:tc>
+        <w:tc>
+          <w:tcPr/>
+          <w:p>
+            <w:pPr>
+              <w:pStyle w:val="Compact"/>
+            </w:pPr>
+            <w:r>
+              <w:t xml:space="preserve">Estándares para redes cableadas</w:t>
+            </w:r>
+          </w:p>
+        </w:tc>
+        <w:tc>
+          <w:tcPr/>
+          <w:p>
+            <w:pPr>
+              <w:pStyle w:val="Compact"/>
+            </w:pPr>
+            <w:r>
+              <w:t xml:space="preserve">✅ Puntos 2-3 y 7</w:t>
             </w:r>
           </w:p>
         </w:tc>
@@ -22825,29 +22952,29 @@
               <w:pStyle w:val="Compact"/>
             </w:pPr>
             <w:r>
-              <w:t xml:space="preserve">c)</w:t>
-            </w:r>
-          </w:p>
-        </w:tc>
-        <w:tc>
-          <w:tcPr/>
-          <w:p>
-            <w:pPr>
-              <w:pStyle w:val="Compact"/>
-            </w:pPr>
-            <w:r>
-              <w:t xml:space="preserve">Comprobadores de conectividad</w:t>
-            </w:r>
-          </w:p>
-        </w:tc>
-        <w:tc>
-          <w:tcPr/>
-          <w:p>
-            <w:pPr>
-              <w:pStyle w:val="Compact"/>
-            </w:pPr>
-            <w:r>
-              <w:t xml:space="preserve">✅ Tester de cables, LEDs, split pair (puntos 4 y 7)</w:t>
+              <w:t xml:space="preserve">RA2·b)</w:t>
+            </w:r>
+          </w:p>
+        </w:tc>
+        <w:tc>
+          <w:tcPr/>
+          <w:p>
+            <w:pPr>
+              <w:pStyle w:val="Compact"/>
+            </w:pPr>
+            <w:r>
+              <w:t xml:space="preserve">Montaje de cables</w:t>
+            </w:r>
+          </w:p>
+        </w:tc>
+        <w:tc>
+          <w:tcPr/>
+          <w:p>
+            <w:pPr>
+              <w:pStyle w:val="Compact"/>
+            </w:pPr>
+            <w:r>
+              <w:t xml:space="preserve">✅ Punto 4 + ⚡ Laboratorio (punto 10)</w:t>
             </w:r>
           </w:p>
         </w:tc>
@@ -22860,29 +22987,29 @@
               <w:pStyle w:val="Compact"/>
             </w:pPr>
             <w:r>
-              <w:t xml:space="preserve">d)</w:t>
-            </w:r>
-          </w:p>
-        </w:tc>
-        <w:tc>
-          <w:tcPr/>
-          <w:p>
-            <w:pPr>
-              <w:pStyle w:val="Compact"/>
-            </w:pPr>
-            <w:r>
-              <w:t xml:space="preserve">Direccionamiento lógico IP</w:t>
-            </w:r>
-          </w:p>
-        </w:tc>
-        <w:tc>
-          <w:tcPr/>
-          <w:p>
-            <w:pPr>
-              <w:pStyle w:val="Compact"/>
-            </w:pPr>
-            <w:r>
-              <w:t xml:space="preserve">✅ (Introducción — se verá más adelante)</w:t>
+              <w:t xml:space="preserve">RA2·c)</w:t>
+            </w:r>
+          </w:p>
+        </w:tc>
+        <w:tc>
+          <w:tcPr/>
+          <w:p>
+            <w:pPr>
+              <w:pStyle w:val="Compact"/>
+            </w:pPr>
+            <w:r>
+              <w:t xml:space="preserve">Comprobadores de conectividad</w:t>
+            </w:r>
+          </w:p>
+        </w:tc>
+        <w:tc>
+          <w:tcPr/>
+          <w:p>
+            <w:pPr>
+              <w:pStyle w:val="Compact"/>
+            </w:pPr>
+            <w:r>
+              <w:t xml:space="preserve">✅ Puntos 4 y 6</w:t>
             </w:r>
           </w:p>
         </w:tc>
@@ -22895,29 +23022,29 @@
               <w:pStyle w:val="Compact"/>
             </w:pPr>
             <w:r>
-              <w:t xml:space="preserve">e)</w:t>
-            </w:r>
-          </w:p>
-        </w:tc>
-        <w:tc>
-          <w:tcPr/>
-          <w:p>
-            <w:pPr>
-              <w:pStyle w:val="Compact"/>
-            </w:pPr>
-            <w:r>
-              <w:t xml:space="preserve">Estándares inalámbricos</w:t>
-            </w:r>
-          </w:p>
-        </w:tc>
-        <w:tc>
-          <w:tcPr/>
-          <w:p>
-            <w:pPr>
-              <w:pStyle w:val="Compact"/>
-            </w:pPr>
-            <w:r>
-              <w:t xml:space="preserve">✅ WiFi 4/5/6/7 (punto 6)</w:t>
+              <w:t xml:space="preserve">RA1·d)</w:t>
+            </w:r>
+          </w:p>
+        </w:tc>
+        <w:tc>
+          <w:tcPr/>
+          <w:p>
+            <w:pPr>
+              <w:pStyle w:val="Compact"/>
+            </w:pPr>
+            <w:r>
+              <w:t xml:space="preserve">Trama y encapsulación Ethernet</w:t>
+            </w:r>
+          </w:p>
+        </w:tc>
+        <w:tc>
+          <w:tcPr/>
+          <w:p>
+            <w:pPr>
+              <w:pStyle w:val="Compact"/>
+            </w:pPr>
+            <w:r>
+              <w:t xml:space="preserve">✅ Puntos 8–9 + 🧠 Atrévete a pensar (punto 10)</w:t>
             </w:r>
           </w:p>
         </w:tc>
@@ -22930,7 +23057,7 @@
               <w:pStyle w:val="Compact"/>
             </w:pPr>
             <w:r>
-              <w:t xml:space="preserve">f)</w:t>
+              <w:t xml:space="preserve">RA2·f)</w:t>
             </w:r>
           </w:p>
         </w:tc>
@@ -22952,7 +23079,7 @@
               <w:pStyle w:val="Compact"/>
             </w:pPr>
             <w:r>
-              <w:t xml:space="preserve">✅ Cableado estructurado (punto 7)</w:t>
+              <w:t xml:space="preserve">✅ Cableado estructurado (punto 7) + ⚡ Laboratorio (punto 10)</w:t>
             </w:r>
           </w:p>
         </w:tc>
@@ -22975,7 +23102,7 @@
       <w:r>
         <w:t xml:space="preserve"> </w:t>
       </w:r>
-      <w:hyperlink r:id="rId40">
+      <w:hyperlink r:id="rId39">
         <w:r>
           <w:rPr>
             <w:rStyle w:val="Hyperlink"/>
@@ -23038,8 +23165,8 @@
         </w:r>
       </w:hyperlink>
     </w:p>
+    <w:bookmarkEnd w:id="172"/>
     <w:bookmarkEnd w:id="173"/>
-    <w:bookmarkEnd w:id="174"/>
     <w:sectPr>
       <w:footnotePr>
         <w:numRestart w:val="eachSect"/>

</xml_diff>